<commit_message>
feat(cover): set the identification block as text
Synced from the source repository at 9ee7482.

Written by tools/publish.py: the docx and its PDF export, the
Markdown export, the figures the Markdown links to, and the two
files that describe this repository.  Nothing here is edited by
hand - the next publish overwrites all of it.
</commit_message>
<xml_diff>
--- a/technical-proposal.docx
+++ b/technical-proposal.docx
@@ -26,312 +26,130 @@
         <w:t xml:space="preserve">技 术 方 案</w:t>
       </w:r>
     </w:p>
-    <w:tbl>
-      <w:tblPr>
-        <w:tblStyle w:val="GridTable"/>
-        <w:tblW w:w="9866" w:type="dxa"/>
-        <w:tblLayout w:type="fixed"/>
-        <w:tblCellMar>
-          <w:top w:w="0" w:type="dxa"/>
-          <w:left w:w="80" w:type="dxa"/>
-          <w:bottom w:w="0" w:type="dxa"/>
-          <w:right w:w="80" w:type="dxa"/>
-        </w:tblCellMar>
-      </w:tblPr>
-      <w:tblGrid>
-        <w:gridCol w:w="1726"/>
-        <w:gridCol w:w="8140"/>
-      </w:tblGrid>
-      <w:tr>
-        <w:trPr>
-          <w:cantSplit/>
-          <w:tblHeader/>
-        </w:trPr>
-        <w:tc>
-          <w:tcPr>
-            <w:tcW w:w="1726" w:type="dxa"/>
-            <w:shd w:val="clear" w:color="auto" w:fill="DCE6F1"/>
-            <w:vAlign w:val="center"/>
-          </w:tcPr>
-          <w:p>
-            <w:pPr>
-              <w:pStyle w:val="TableHead"/>
-              <w:jc w:val="center"/>
-            </w:pPr>
-            <w:r>
-              <w:t xml:space="preserve">项目</w:t>
-            </w:r>
-          </w:p>
-        </w:tc>
-        <w:tc>
-          <w:tcPr>
-            <w:tcW w:w="8140" w:type="dxa"/>
-            <w:shd w:val="clear" w:color="auto" w:fill="DCE6F1"/>
-            <w:vAlign w:val="center"/>
-          </w:tcPr>
-          <w:p>
-            <w:pPr>
-              <w:pStyle w:val="TableHead"/>
-              <w:jc w:val="center"/>
-            </w:pPr>
-            <w:r>
-              <w:t xml:space="preserve">内容</w:t>
-            </w:r>
-          </w:p>
-        </w:tc>
-      </w:tr>
-      <w:tr>
-        <w:trPr>
-          <w:cantSplit/>
-        </w:trPr>
-        <w:tc>
-          <w:tcPr>
-            <w:tcW w:w="1726" w:type="dxa"/>
-            <w:vAlign w:val="center"/>
-          </w:tcPr>
-          <w:p>
-            <w:pPr>
-              <w:pStyle w:val="TableText"/>
-              <w:jc w:val="center"/>
-            </w:pPr>
-            <w:r>
-              <w:t xml:space="preserve">赛题编号</w:t>
-            </w:r>
-          </w:p>
-        </w:tc>
-        <w:tc>
-          <w:tcPr>
-            <w:tcW w:w="8140" w:type="dxa"/>
-            <w:vAlign w:val="center"/>
-          </w:tcPr>
-          <w:p>
-            <w:pPr>
-              <w:pStyle w:val="TableText"/>
-              <w:jc w:val="left"/>
-            </w:pPr>
-            <w:r>
-              <w:t xml:space="preserve">XA-202612</w:t>
-            </w:r>
-          </w:p>
-        </w:tc>
-      </w:tr>
-      <w:tr>
-        <w:trPr>
-          <w:cantSplit/>
-        </w:trPr>
-        <w:tc>
-          <w:tcPr>
-            <w:tcW w:w="1726" w:type="dxa"/>
-            <w:vAlign w:val="center"/>
-          </w:tcPr>
-          <w:p>
-            <w:pPr>
-              <w:pStyle w:val="TableText"/>
-              <w:jc w:val="center"/>
-            </w:pPr>
-            <w:r>
-              <w:t xml:space="preserve">赛题名称</w:t>
-            </w:r>
-          </w:p>
-        </w:tc>
-        <w:tc>
-          <w:tcPr>
-            <w:tcW w:w="8140" w:type="dxa"/>
-            <w:vAlign w:val="center"/>
-          </w:tcPr>
-          <w:p>
-            <w:pPr>
-              <w:pStyle w:val="TableText"/>
-              <w:jc w:val="left"/>
-            </w:pPr>
-            <w:r>
-              <w:t xml:space="preserve">OS Agent 记忆优化及高效应用研究</w:t>
-            </w:r>
-          </w:p>
-        </w:tc>
-      </w:tr>
-      <w:tr>
-        <w:trPr>
-          <w:cantSplit/>
-        </w:trPr>
-        <w:tc>
-          <w:tcPr>
-            <w:tcW w:w="1726" w:type="dxa"/>
-            <w:vAlign w:val="center"/>
-          </w:tcPr>
-          <w:p>
-            <w:pPr>
-              <w:pStyle w:val="TableText"/>
-              <w:jc w:val="center"/>
-            </w:pPr>
-            <w:r>
-              <w:t xml:space="preserve">作品名称</w:t>
-            </w:r>
-          </w:p>
-        </w:tc>
-        <w:tc>
-          <w:tcPr>
-            <w:tcW w:w="8140" w:type="dxa"/>
-            <w:vAlign w:val="center"/>
-          </w:tcPr>
-          <w:p>
-            <w:pPr>
-              <w:pStyle w:val="TableText"/>
-              <w:jc w:val="left"/>
-            </w:pPr>
-            <w:r>
-              <w:t xml:space="preserve">麒忆智脑（工程代号 MOKOA）</w:t>
-            </w:r>
-          </w:p>
-        </w:tc>
-      </w:tr>
-      <w:tr>
-        <w:trPr>
-          <w:cantSplit/>
-        </w:trPr>
-        <w:tc>
-          <w:tcPr>
-            <w:tcW w:w="1726" w:type="dxa"/>
-            <w:vAlign w:val="center"/>
-          </w:tcPr>
-          <w:p>
-            <w:pPr>
-              <w:pStyle w:val="TableText"/>
-              <w:jc w:val="center"/>
-            </w:pPr>
-            <w:r>
-              <w:t xml:space="preserve">文档类型</w:t>
-            </w:r>
-          </w:p>
-        </w:tc>
-        <w:tc>
-          <w:tcPr>
-            <w:tcW w:w="8140" w:type="dxa"/>
-            <w:vAlign w:val="center"/>
-          </w:tcPr>
-          <w:p>
-            <w:pPr>
-              <w:pStyle w:val="TableText"/>
-              <w:jc w:val="left"/>
-            </w:pPr>
-            <w:r>
-              <w:t xml:space="preserve">技术方案（含技术文档、效果验证报告与用户手册）</w:t>
-            </w:r>
-          </w:p>
-        </w:tc>
-      </w:tr>
-      <w:tr>
-        <w:trPr>
-          <w:cantSplit/>
-        </w:trPr>
-        <w:tc>
-          <w:tcPr>
-            <w:tcW w:w="1726" w:type="dxa"/>
-            <w:vAlign w:val="center"/>
-          </w:tcPr>
-          <w:p>
-            <w:pPr>
-              <w:pStyle w:val="TableText"/>
-              <w:jc w:val="center"/>
-            </w:pPr>
-            <w:r>
-              <w:t xml:space="preserve">文档版本</w:t>
-            </w:r>
-          </w:p>
-        </w:tc>
-        <w:tc>
-          <w:tcPr>
-            <w:tcW w:w="8140" w:type="dxa"/>
-            <w:vAlign w:val="center"/>
-          </w:tcPr>
-          <w:p>
-            <w:pPr>
-              <w:pStyle w:val="TableText"/>
-              <w:jc w:val="left"/>
-            </w:pPr>
-            <w:r>
-              <w:t xml:space="preserve">v1.0</w:t>
-            </w:r>
-          </w:p>
-        </w:tc>
-      </w:tr>
-      <w:tr>
-        <w:trPr>
-          <w:cantSplit/>
-        </w:trPr>
-        <w:tc>
-          <w:tcPr>
-            <w:tcW w:w="1726" w:type="dxa"/>
-            <w:vAlign w:val="center"/>
-          </w:tcPr>
-          <w:p>
-            <w:pPr>
-              <w:pStyle w:val="TableText"/>
-              <w:jc w:val="center"/>
-            </w:pPr>
-            <w:r>
-              <w:t xml:space="preserve">编制日期</w:t>
-            </w:r>
-          </w:p>
-        </w:tc>
-        <w:tc>
-          <w:tcPr>
-            <w:tcW w:w="8140" w:type="dxa"/>
-            <w:vAlign w:val="center"/>
-          </w:tcPr>
-          <w:p>
-            <w:pPr>
-              <w:pStyle w:val="TableText"/>
-              <w:jc w:val="left"/>
-            </w:pPr>
-            <w:r>
-              <w:t xml:space="preserve">2026 年 9 月</w:t>
-            </w:r>
-          </w:p>
-        </w:tc>
-      </w:tr>
-      <w:tr>
-        <w:trPr>
-          <w:cantSplit/>
-        </w:trPr>
-        <w:tc>
-          <w:tcPr>
-            <w:tcW w:w="1726" w:type="dxa"/>
-            <w:vAlign w:val="center"/>
-          </w:tcPr>
-          <w:p>
-            <w:pPr>
-              <w:pStyle w:val="TableText"/>
-              <w:jc w:val="center"/>
-            </w:pPr>
-            <w:r>
-              <w:t xml:space="preserve">文档用途</w:t>
-            </w:r>
-          </w:p>
-        </w:tc>
-        <w:tc>
-          <w:tcPr>
-            <w:tcW w:w="8140" w:type="dxa"/>
-            <w:vAlign w:val="center"/>
-          </w:tcPr>
-          <w:p>
-            <w:pPr>
-              <w:pStyle w:val="TableText"/>
-              <w:jc w:val="left"/>
-            </w:pPr>
-            <w:r>
-              <w:t xml:space="preserve">2026 挑战杯揭榜挂帅专项赛参赛作品提交件</w:t>
-            </w:r>
-          </w:p>
-        </w:tc>
-      </w:tr>
-    </w:tbl>
-    <w:p>
-      <w:pPr>
-        <w:spacing w:after="0"/>
-      </w:pPr>
-      <w:r>
-        <w:t/>
+    <w:p>
+      <w:pPr>
+        <w:pStyle w:val="CoverMeta"/>
+        <w:tabs>
+          <w:tab w:val="left" w:pos="3000"/>
+        </w:tabs>
+        <w:ind w:left="1500"/>
+      </w:pPr>
+      <w:r>
+        <w:t xml:space="preserve">赛题编号</w:t>
+      </w:r>
+      <w:r>
+        <w:tab/>
+      </w:r>
+      <w:r>
+        <w:t xml:space="preserve">XA-202612</w:t>
+      </w:r>
+    </w:p>
+    <w:p>
+      <w:pPr>
+        <w:pStyle w:val="CoverMeta"/>
+        <w:tabs>
+          <w:tab w:val="left" w:pos="3000"/>
+        </w:tabs>
+        <w:ind w:left="1500"/>
+      </w:pPr>
+      <w:r>
+        <w:t xml:space="preserve">赛题名称</w:t>
+      </w:r>
+      <w:r>
+        <w:tab/>
+      </w:r>
+      <w:r>
+        <w:t xml:space="preserve">OS Agent 记忆优化及高效应用研究</w:t>
+      </w:r>
+    </w:p>
+    <w:p>
+      <w:pPr>
+        <w:pStyle w:val="CoverMeta"/>
+        <w:tabs>
+          <w:tab w:val="left" w:pos="3000"/>
+        </w:tabs>
+        <w:ind w:left="1500"/>
+      </w:pPr>
+      <w:r>
+        <w:t xml:space="preserve">作品名称</w:t>
+      </w:r>
+      <w:r>
+        <w:tab/>
+      </w:r>
+      <w:r>
+        <w:t xml:space="preserve">麒忆智脑 (工程代号 MOKOA)</w:t>
+      </w:r>
+    </w:p>
+    <w:p>
+      <w:pPr>
+        <w:pStyle w:val="CoverMeta"/>
+        <w:tabs>
+          <w:tab w:val="left" w:pos="3000"/>
+        </w:tabs>
+        <w:ind w:left="1500"/>
+      </w:pPr>
+      <w:r>
+        <w:t xml:space="preserve">文档类型</w:t>
+      </w:r>
+      <w:r>
+        <w:tab/>
+      </w:r>
+      <w:r>
+        <w:t xml:space="preserve">技术方案 (含技术文档、效果验证报告与用户手册)</w:t>
+      </w:r>
+    </w:p>
+    <w:p>
+      <w:pPr>
+        <w:pStyle w:val="CoverMeta"/>
+        <w:tabs>
+          <w:tab w:val="left" w:pos="3000"/>
+        </w:tabs>
+        <w:ind w:left="1500"/>
+      </w:pPr>
+      <w:r>
+        <w:t xml:space="preserve">文档版本</w:t>
+      </w:r>
+      <w:r>
+        <w:tab/>
+      </w:r>
+      <w:r>
+        <w:t xml:space="preserve">v1.0</w:t>
+      </w:r>
+    </w:p>
+    <w:p>
+      <w:pPr>
+        <w:pStyle w:val="CoverMeta"/>
+        <w:tabs>
+          <w:tab w:val="left" w:pos="3000"/>
+        </w:tabs>
+        <w:ind w:left="1500"/>
+      </w:pPr>
+      <w:r>
+        <w:t xml:space="preserve">编制日期</w:t>
+      </w:r>
+      <w:r>
+        <w:tab/>
+      </w:r>
+      <w:r>
+        <w:t xml:space="preserve">2026 年 9 月</w:t>
+      </w:r>
+    </w:p>
+    <w:p>
+      <w:pPr>
+        <w:pStyle w:val="CoverMeta"/>
+        <w:tabs>
+          <w:tab w:val="left" w:pos="3000"/>
+        </w:tabs>
+        <w:ind w:left="1500"/>
+      </w:pPr>
+      <w:r>
+        <w:t xml:space="preserve">文档用途</w:t>
+      </w:r>
+      <w:r>
+        <w:tab/>
+      </w:r>
+      <w:r>
+        <w:t xml:space="preserve">2026 挑战杯揭榜挂帅专项赛参赛作品提交件</w:t>
       </w:r>
     </w:p>
     <w:p>
@@ -31770,6 +31588,21 @@
       <w:color w:val="404040"/>
       <w:sz w:val="28"/>
       <w:szCs w:val="28"/>
+    </w:rPr>
+  </w:style>
+  <w:style w:type="paragraph" w:styleId="CoverMeta">
+    <w:name w:val="Cover Meta"/>
+    <w:basedOn w:val="Normal"/>
+    <w:qFormat/>
+    <w:pPr>
+      <w:spacing w:before="60" w:after="60" w:line="300" w:lineRule="auto"/>
+      <w:jc w:val="left"/>
+    </w:pPr>
+    <w:rPr>
+      <w:rFonts w:eastAsia="楷体"/>
+      <w:color w:val="404040"/>
+      <w:sz w:val="24"/>
+      <w:szCs w:val="24"/>
     </w:rPr>
   </w:style>
   <w:style w:type="paragraph" w:styleId="Heading1">

</xml_diff>

<commit_message>
feat(manual): embed the real screenshots
Synced from the source repository at 5a5e4ca.

Written by tools/publish.py: the docx and its PDF export, the
Markdown export, the figures the Markdown links to, and the two
files that describe this repository.  Nothing here is edited by
hand - the next publish overwrites all of it.
</commit_message>
<xml_diff>
--- a/technical-proposal.docx
+++ b/technical-proposal.docx
@@ -25561,51 +25561,48 @@
         <w:t xml:space="preserve">顶栏实时显示后端连接状态。若显示未连接，说明前端尚未指向运行中的 API 服务。</w:t>
       </w:r>
     </w:p>
-    <w:tbl>
-      <w:tblPr>
-        <w:tblStyle w:val="FigureFrame"/>
-        <w:tblW w:w="9866" w:type="dxa"/>
-        <w:tblLayout w:type="fixed"/>
-      </w:tblPr>
-      <w:tblGrid>
-        <w:gridCol w:w="9866"/>
-      </w:tblGrid>
-      <w:tr>
-        <w:trPr>
-          <w:cantSplit/>
-          <w:trHeight w:val="2700"/>
-        </w:trPr>
-        <w:tc>
-          <w:tcPr>
-            <w:tcW w:w="9866" w:type="dxa"/>
-            <w:shd w:val="clear" w:color="auto" w:fill="FAFAFA"/>
-            <w:vAlign w:val="center"/>
-          </w:tcPr>
-          <w:p>
-            <w:pPr>
-              <w:spacing w:before="60" w:after="40"/>
-              <w:jc w:val="center"/>
-            </w:pPr>
-            <w:r>
-              <w:rPr>
-                <w:rFonts w:eastAsia="黑体"/>
-                <w:b/>
-                <w:color w:val="7F7F7F"/>
-                <w:sz w:val="21"/>
-                <w:szCs w:val="21"/>
-              </w:rPr>
-              <w:t xml:space="preserve">【图 12-1 截图位置】</w:t>
-            </w:r>
-          </w:p>
-        </w:tc>
-      </w:tr>
-    </w:tbl>
-    <w:p>
-      <w:pPr>
-        <w:spacing w:after="0"/>
-      </w:pPr>
-      <w:r>
-        <w:t/>
+    <w:p>
+      <w:pPr>
+        <w:keepNext/>
+        <w:spacing w:before="140" w:after="60"/>
+        <w:jc w:val="center"/>
+      </w:pPr>
+      <w:r>
+        <w:drawing>
+          <wp:inline distT="0" distB="0" distL="0" distR="0">
+            <wp:extent cx="5731510" cy="3188152"/>
+            <wp:effectExtent l="0" t="0" r="0" b="0"/>
+            <wp:docPr id="111" name="Figure 111"/>
+            <wp:cNvGraphicFramePr>
+              <a:graphicFrameLocks noChangeAspect="1"/>
+            </wp:cNvGraphicFramePr>
+            <a:graphic>
+              <a:graphicData uri="http://schemas.openxmlformats.org/drawingml/2006/picture">
+                <pic:pic>
+                  <pic:nvPicPr>
+                    <pic:cNvPr id="111" name="Figure 111"/>
+                    <pic:cNvPicPr/>
+                  </pic:nvPicPr>
+                  <pic:blipFill>
+                    <a:blip r:embed="rId24"/>
+                    <a:stretch>
+                      <a:fillRect/>
+                    </a:stretch>
+                  </pic:blipFill>
+                  <pic:spPr>
+                    <a:xfrm>
+                      <a:off x="0" y="0"/>
+                      <a:ext cx="5731510" cy="3188152"/>
+                    </a:xfrm>
+                    <a:prstGeom prst="rect">
+                      <a:avLst/>
+                    </a:prstGeom>
+                  </pic:spPr>
+                </pic:pic>
+              </a:graphicData>
+            </a:graphic>
+          </wp:inline>
+        </w:drawing>
       </w:r>
     </w:p>
     <w:p>
@@ -25647,7 +25644,7 @@
         <w:tab/>
       </w:r>
       <w:r>
-        <w:t xml:space="preserve">进入「写入记忆」页，按数据源选择标签页：对话输入、工具调用结果、用户行为、手动配置。</w:t>
+        <w:t xml:space="preserve">进入「写入记忆」页，按数据源选择：文件 / 图片、工具结果、用户行为、手动配置、文本对话。</w:t>
       </w:r>
     </w:p>
     <w:p>
@@ -25686,51 +25683,48 @@
         <w:t xml:space="preserve">若返回低质量拒绝，可按提示补充信息量或改为多次观测后重试。</w:t>
       </w:r>
     </w:p>
-    <w:tbl>
-      <w:tblPr>
-        <w:tblStyle w:val="FigureFrame"/>
-        <w:tblW w:w="9866" w:type="dxa"/>
-        <w:tblLayout w:type="fixed"/>
-      </w:tblPr>
-      <w:tblGrid>
-        <w:gridCol w:w="9866"/>
-      </w:tblGrid>
-      <w:tr>
-        <w:trPr>
-          <w:cantSplit/>
-          <w:trHeight w:val="2700"/>
-        </w:trPr>
-        <w:tc>
-          <w:tcPr>
-            <w:tcW w:w="9866" w:type="dxa"/>
-            <w:shd w:val="clear" w:color="auto" w:fill="FAFAFA"/>
-            <w:vAlign w:val="center"/>
-          </w:tcPr>
-          <w:p>
-            <w:pPr>
-              <w:spacing w:before="60" w:after="40"/>
-              <w:jc w:val="center"/>
-            </w:pPr>
-            <w:r>
-              <w:rPr>
-                <w:rFonts w:eastAsia="黑体"/>
-                <w:b/>
-                <w:color w:val="7F7F7F"/>
-                <w:sz w:val="21"/>
-                <w:szCs w:val="21"/>
-              </w:rPr>
-              <w:t xml:space="preserve">【图 12-2 截图位置】</w:t>
-            </w:r>
-          </w:p>
-        </w:tc>
-      </w:tr>
-    </w:tbl>
-    <w:p>
-      <w:pPr>
-        <w:spacing w:after="0"/>
-      </w:pPr>
-      <w:r>
-        <w:t/>
+    <w:p>
+      <w:pPr>
+        <w:keepNext/>
+        <w:spacing w:before="140" w:after="60"/>
+        <w:jc w:val="center"/>
+      </w:pPr>
+      <w:r>
+        <w:drawing>
+          <wp:inline distT="0" distB="0" distL="0" distR="0">
+            <wp:extent cx="5731510" cy="3234056"/>
+            <wp:effectExtent l="0" t="0" r="0" b="0"/>
+            <wp:docPr id="112" name="Figure 112"/>
+            <wp:cNvGraphicFramePr>
+              <a:graphicFrameLocks noChangeAspect="1"/>
+            </wp:cNvGraphicFramePr>
+            <a:graphic>
+              <a:graphicData uri="http://schemas.openxmlformats.org/drawingml/2006/picture">
+                <pic:pic>
+                  <pic:nvPicPr>
+                    <pic:cNvPr id="112" name="Figure 112"/>
+                    <pic:cNvPicPr/>
+                  </pic:nvPicPr>
+                  <pic:blipFill>
+                    <a:blip r:embed="rId25"/>
+                    <a:stretch>
+                      <a:fillRect/>
+                    </a:stretch>
+                  </pic:blipFill>
+                  <pic:spPr>
+                    <a:xfrm>
+                      <a:off x="0" y="0"/>
+                      <a:ext cx="5731510" cy="3234056"/>
+                    </a:xfrm>
+                    <a:prstGeom prst="rect">
+                      <a:avLst/>
+                    </a:prstGeom>
+                  </pic:spPr>
+                </pic:pic>
+              </a:graphicData>
+            </a:graphic>
+          </wp:inline>
+        </w:drawing>
       </w:r>
     </w:p>
     <w:p>
@@ -25738,7 +25732,111 @@
         <w:pStyle w:val="Caption"/>
       </w:pPr>
       <w:r>
-        <w:t xml:space="preserve">图 12-2  写入记忆与质量反馈</w:t>
+        <w:t xml:space="preserve">图 12-2(a)  写入记忆页：对话写入与多源数据接入</w:t>
+      </w:r>
+    </w:p>
+    <w:p>
+      <w:pPr>
+        <w:keepNext/>
+        <w:spacing w:before="140" w:after="60"/>
+        <w:jc w:val="center"/>
+      </w:pPr>
+      <w:r>
+        <w:drawing>
+          <wp:inline distT="0" distB="0" distL="0" distR="0">
+            <wp:extent cx="3456285" cy="3931920"/>
+            <wp:effectExtent l="0" t="0" r="0" b="0"/>
+            <wp:docPr id="113" name="Figure 113"/>
+            <wp:cNvGraphicFramePr>
+              <a:graphicFrameLocks noChangeAspect="1"/>
+            </wp:cNvGraphicFramePr>
+            <a:graphic>
+              <a:graphicData uri="http://schemas.openxmlformats.org/drawingml/2006/picture">
+                <pic:pic>
+                  <pic:nvPicPr>
+                    <pic:cNvPr id="113" name="Figure 113"/>
+                    <pic:cNvPicPr/>
+                  </pic:nvPicPr>
+                  <pic:blipFill>
+                    <a:blip r:embed="rId26"/>
+                    <a:stretch>
+                      <a:fillRect/>
+                    </a:stretch>
+                  </pic:blipFill>
+                  <pic:spPr>
+                    <a:xfrm>
+                      <a:off x="0" y="0"/>
+                      <a:ext cx="3456285" cy="3931920"/>
+                    </a:xfrm>
+                    <a:prstGeom prst="rect">
+                      <a:avLst/>
+                    </a:prstGeom>
+                  </pic:spPr>
+                </pic:pic>
+              </a:graphicData>
+            </a:graphic>
+          </wp:inline>
+        </w:drawing>
+      </w:r>
+    </w:p>
+    <w:p>
+      <w:pPr>
+        <w:pStyle w:val="Caption"/>
+      </w:pPr>
+      <w:r>
+        <w:t xml:space="preserve">图 12-2(b)  本次会话处理记录：各来源的质量分与处理耗时</w:t>
+      </w:r>
+    </w:p>
+    <w:p>
+      <w:pPr>
+        <w:keepNext/>
+        <w:spacing w:before="140" w:after="60"/>
+        <w:jc w:val="center"/>
+      </w:pPr>
+      <w:r>
+        <w:drawing>
+          <wp:inline distT="0" distB="0" distL="0" distR="0">
+            <wp:extent cx="3464910" cy="3931920"/>
+            <wp:effectExtent l="0" t="0" r="0" b="0"/>
+            <wp:docPr id="114" name="Figure 114"/>
+            <wp:cNvGraphicFramePr>
+              <a:graphicFrameLocks noChangeAspect="1"/>
+            </wp:cNvGraphicFramePr>
+            <a:graphic>
+              <a:graphicData uri="http://schemas.openxmlformats.org/drawingml/2006/picture">
+                <pic:pic>
+                  <pic:nvPicPr>
+                    <pic:cNvPr id="114" name="Figure 114"/>
+                    <pic:cNvPicPr/>
+                  </pic:nvPicPr>
+                  <pic:blipFill>
+                    <a:blip r:embed="rId27"/>
+                    <a:stretch>
+                      <a:fillRect/>
+                    </a:stretch>
+                  </pic:blipFill>
+                  <pic:spPr>
+                    <a:xfrm>
+                      <a:off x="0" y="0"/>
+                      <a:ext cx="3464910" cy="3931920"/>
+                    </a:xfrm>
+                    <a:prstGeom prst="rect">
+                      <a:avLst/>
+                    </a:prstGeom>
+                  </pic:spPr>
+                </pic:pic>
+              </a:graphicData>
+            </a:graphic>
+          </wp:inline>
+        </w:drawing>
+      </w:r>
+    </w:p>
+    <w:p>
+      <w:pPr>
+        <w:pStyle w:val="Caption"/>
+      </w:pPr>
+      <w:r>
+        <w:t xml:space="preserve">图 12-2(c)  数据来源的五类选项与场景标注</w:t>
       </w:r>
     </w:p>
     <w:p>
@@ -25803,51 +25901,48 @@
         <w:t xml:space="preserve">切换至历史视图可查看完整版本链，含被替代的记录与替代关系。</w:t>
       </w:r>
     </w:p>
-    <w:tbl>
-      <w:tblPr>
-        <w:tblStyle w:val="FigureFrame"/>
-        <w:tblW w:w="9866" w:type="dxa"/>
-        <w:tblLayout w:type="fixed"/>
-      </w:tblPr>
-      <w:tblGrid>
-        <w:gridCol w:w="9866"/>
-      </w:tblGrid>
-      <w:tr>
-        <w:trPr>
-          <w:cantSplit/>
-          <w:trHeight w:val="2700"/>
-        </w:trPr>
-        <w:tc>
-          <w:tcPr>
-            <w:tcW w:w="9866" w:type="dxa"/>
-            <w:shd w:val="clear" w:color="auto" w:fill="FAFAFA"/>
-            <w:vAlign w:val="center"/>
-          </w:tcPr>
-          <w:p>
-            <w:pPr>
-              <w:spacing w:before="60" w:after="40"/>
-              <w:jc w:val="center"/>
-            </w:pPr>
-            <w:r>
-              <w:rPr>
-                <w:rFonts w:eastAsia="黑体"/>
-                <w:b/>
-                <w:color w:val="7F7F7F"/>
-                <w:sz w:val="21"/>
-                <w:szCs w:val="21"/>
-              </w:rPr>
-              <w:t xml:space="preserve">【图 12-3 截图位置】</w:t>
-            </w:r>
-          </w:p>
-        </w:tc>
-      </w:tr>
-    </w:tbl>
-    <w:p>
-      <w:pPr>
-        <w:spacing w:after="0"/>
-      </w:pPr>
-      <w:r>
-        <w:t/>
+    <w:p>
+      <w:pPr>
+        <w:keepNext/>
+        <w:spacing w:before="140" w:after="60"/>
+        <w:jc w:val="center"/>
+      </w:pPr>
+      <w:r>
+        <w:drawing>
+          <wp:inline distT="0" distB="0" distL="0" distR="0">
+            <wp:extent cx="5731510" cy="3183675"/>
+            <wp:effectExtent l="0" t="0" r="0" b="0"/>
+            <wp:docPr id="115" name="Figure 115"/>
+            <wp:cNvGraphicFramePr>
+              <a:graphicFrameLocks noChangeAspect="1"/>
+            </wp:cNvGraphicFramePr>
+            <a:graphic>
+              <a:graphicData uri="http://schemas.openxmlformats.org/drawingml/2006/picture">
+                <pic:pic>
+                  <pic:nvPicPr>
+                    <pic:cNvPr id="115" name="Figure 115"/>
+                    <pic:cNvPicPr/>
+                  </pic:nvPicPr>
+                  <pic:blipFill>
+                    <a:blip r:embed="rId28"/>
+                    <a:stretch>
+                      <a:fillRect/>
+                    </a:stretch>
+                  </pic:blipFill>
+                  <pic:spPr>
+                    <a:xfrm>
+                      <a:off x="0" y="0"/>
+                      <a:ext cx="5731510" cy="3183675"/>
+                    </a:xfrm>
+                    <a:prstGeom prst="rect">
+                      <a:avLst/>
+                    </a:prstGeom>
+                  </pic:spPr>
+                </pic:pic>
+              </a:graphicData>
+            </a:graphic>
+          </wp:inline>
+        </w:drawing>
       </w:r>
     </w:p>
     <w:p>
@@ -25920,51 +26015,48 @@
         <w:t xml:space="preserve">结果卡片展示内容、相似度分数、记忆层级与响应耗时；耗时徽标用于直观确认 ≤500ms 指标。</w:t>
       </w:r>
     </w:p>
-    <w:tbl>
-      <w:tblPr>
-        <w:tblStyle w:val="FigureFrame"/>
-        <w:tblW w:w="9866" w:type="dxa"/>
-        <w:tblLayout w:type="fixed"/>
-      </w:tblPr>
-      <w:tblGrid>
-        <w:gridCol w:w="9866"/>
-      </w:tblGrid>
-      <w:tr>
-        <w:trPr>
-          <w:cantSplit/>
-          <w:trHeight w:val="2700"/>
-        </w:trPr>
-        <w:tc>
-          <w:tcPr>
-            <w:tcW w:w="9866" w:type="dxa"/>
-            <w:shd w:val="clear" w:color="auto" w:fill="FAFAFA"/>
-            <w:vAlign w:val="center"/>
-          </w:tcPr>
-          <w:p>
-            <w:pPr>
-              <w:spacing w:before="60" w:after="40"/>
-              <w:jc w:val="center"/>
-            </w:pPr>
-            <w:r>
-              <w:rPr>
-                <w:rFonts w:eastAsia="黑体"/>
-                <w:b/>
-                <w:color w:val="7F7F7F"/>
-                <w:sz w:val="21"/>
-                <w:szCs w:val="21"/>
-              </w:rPr>
-              <w:t xml:space="preserve">【图 12-4 截图位置】</w:t>
-            </w:r>
-          </w:p>
-        </w:tc>
-      </w:tr>
-    </w:tbl>
-    <w:p>
-      <w:pPr>
-        <w:spacing w:after="0"/>
-      </w:pPr>
-      <w:r>
-        <w:t/>
+    <w:p>
+      <w:pPr>
+        <w:keepNext/>
+        <w:spacing w:before="140" w:after="60"/>
+        <w:jc w:val="center"/>
+      </w:pPr>
+      <w:r>
+        <w:drawing>
+          <wp:inline distT="0" distB="0" distL="0" distR="0">
+            <wp:extent cx="5731510" cy="3174719"/>
+            <wp:effectExtent l="0" t="0" r="0" b="0"/>
+            <wp:docPr id="116" name="Figure 116"/>
+            <wp:cNvGraphicFramePr>
+              <a:graphicFrameLocks noChangeAspect="1"/>
+            </wp:cNvGraphicFramePr>
+            <a:graphic>
+              <a:graphicData uri="http://schemas.openxmlformats.org/drawingml/2006/picture">
+                <pic:pic>
+                  <pic:nvPicPr>
+                    <pic:cNvPr id="116" name="Figure 116"/>
+                    <pic:cNvPicPr/>
+                  </pic:nvPicPr>
+                  <pic:blipFill>
+                    <a:blip r:embed="rId29"/>
+                    <a:stretch>
+                      <a:fillRect/>
+                    </a:stretch>
+                  </pic:blipFill>
+                  <pic:spPr>
+                    <a:xfrm>
+                      <a:off x="0" y="0"/>
+                      <a:ext cx="5731510" cy="3174719"/>
+                    </a:xfrm>
+                    <a:prstGeom prst="rect">
+                      <a:avLst/>
+                    </a:prstGeom>
+                  </pic:spPr>
+                </pic:pic>
+              </a:graphicData>
+            </a:graphic>
+          </wp:inline>
+        </w:drawing>
       </w:r>
     </w:p>
     <w:p>
@@ -26037,51 +26129,48 @@
         <w:t xml:space="preserve">回到「偏好画像」页确认目标值已不再出现在生效偏好中。</w:t>
       </w:r>
     </w:p>
-    <w:tbl>
-      <w:tblPr>
-        <w:tblStyle w:val="FigureFrame"/>
-        <w:tblW w:w="9866" w:type="dxa"/>
-        <w:tblLayout w:type="fixed"/>
-      </w:tblPr>
-      <w:tblGrid>
-        <w:gridCol w:w="9866"/>
-      </w:tblGrid>
-      <w:tr>
-        <w:trPr>
-          <w:cantSplit/>
-          <w:trHeight w:val="2700"/>
-        </w:trPr>
-        <w:tc>
-          <w:tcPr>
-            <w:tcW w:w="9866" w:type="dxa"/>
-            <w:shd w:val="clear" w:color="auto" w:fill="FAFAFA"/>
-            <w:vAlign w:val="center"/>
-          </w:tcPr>
-          <w:p>
-            <w:pPr>
-              <w:spacing w:before="60" w:after="40"/>
-              <w:jc w:val="center"/>
-            </w:pPr>
-            <w:r>
-              <w:rPr>
-                <w:rFonts w:eastAsia="黑体"/>
-                <w:b/>
-                <w:color w:val="7F7F7F"/>
-                <w:sz w:val="21"/>
-                <w:szCs w:val="21"/>
-              </w:rPr>
-              <w:t xml:space="preserve">【图 12-5 截图位置】</w:t>
-            </w:r>
-          </w:p>
-        </w:tc>
-      </w:tr>
-    </w:tbl>
-    <w:p>
-      <w:pPr>
-        <w:spacing w:after="0"/>
-      </w:pPr>
-      <w:r>
-        <w:t/>
+    <w:p>
+      <w:pPr>
+        <w:keepNext/>
+        <w:spacing w:before="140" w:after="60"/>
+        <w:jc w:val="center"/>
+      </w:pPr>
+      <w:r>
+        <w:drawing>
+          <wp:inline distT="0" distB="0" distL="0" distR="0">
+            <wp:extent cx="5731510" cy="3335918"/>
+            <wp:effectExtent l="0" t="0" r="0" b="0"/>
+            <wp:docPr id="117" name="Figure 117"/>
+            <wp:cNvGraphicFramePr>
+              <a:graphicFrameLocks noChangeAspect="1"/>
+            </wp:cNvGraphicFramePr>
+            <a:graphic>
+              <a:graphicData uri="http://schemas.openxmlformats.org/drawingml/2006/picture">
+                <pic:pic>
+                  <pic:nvPicPr>
+                    <pic:cNvPr id="117" name="Figure 117"/>
+                    <pic:cNvPicPr/>
+                  </pic:nvPicPr>
+                  <pic:blipFill>
+                    <a:blip r:embed="rId30"/>
+                    <a:stretch>
+                      <a:fillRect/>
+                    </a:stretch>
+                  </pic:blipFill>
+                  <pic:spPr>
+                    <a:xfrm>
+                      <a:off x="0" y="0"/>
+                      <a:ext cx="5731510" cy="3335918"/>
+                    </a:xfrm>
+                    <a:prstGeom prst="rect">
+                      <a:avLst/>
+                    </a:prstGeom>
+                  </pic:spPr>
+                </pic:pic>
+              </a:graphicData>
+            </a:graphic>
+          </wp:inline>
+        </w:drawing>
       </w:r>
     </w:p>
     <w:p>

</xml_diff>

<commit_message>
feat(cover): move the identification block to the lower third
Synced from the source repository at 99b1f95.

Written by tools/publish.py: the docx and its PDF export, the
Markdown export, the figures the Markdown links to, and the two
files that describe this repository.  Nothing here is edited by
hand - the next publish overwrites all of it.
</commit_message>
<xml_diff>
--- a/technical-proposal.docx
+++ b/technical-proposal.docx
@@ -25,6 +25,11 @@
       <w:r>
         <w:t xml:space="preserve">技 术 方 案</w:t>
       </w:r>
+    </w:p>
+    <w:p>
+      <w:pPr>
+        <w:spacing w:before="0" w:after="0" w:line="7000" w:lineRule="exact"/>
+      </w:pPr>
     </w:p>
     <w:p>
       <w:pPr>

</xml_diff>

<commit_message>
fix(doc): make the table captions and figure labels hold where they belong
Synced from the source repository at 348cc81.

Written by tools/publish.py: the docx and its PDF export, the
Markdown export, the figures the Markdown links to, and the two
files that describe this repository.  Nothing here is edited by
hand - the next publish overwrites all of it.
</commit_message>
<xml_diff>
--- a/technical-proposal.docx
+++ b/technical-proposal.docx
@@ -940,7 +940,7 @@
               <w:jc w:val="left"/>
             </w:pPr>
             <w:r>
-              <w:t xml:space="preserve">三层记忆、热度晋升与语义固化</w:t>
+              <w:t xml:space="preserve">三层记忆、热度晋升与长期化</w:t>
             </w:r>
           </w:p>
         </w:tc>
@@ -1381,6 +1381,9 @@
         <w:ind w:left="420" w:hanging="210"/>
       </w:pPr>
       <w:r>
+        <w:rPr>
+          <w:rFonts w:ascii="Times New Roman" w:hAnsi="Times New Roman" w:cs="Times New Roman"/>
+        </w:rPr>
         <w:t xml:space="preserve">•</w:t>
       </w:r>
       <w:r>
@@ -1405,6 +1408,9 @@
         <w:ind w:left="420" w:hanging="210"/>
       </w:pPr>
       <w:r>
+        <w:rPr>
+          <w:rFonts w:ascii="Times New Roman" w:hAnsi="Times New Roman" w:cs="Times New Roman"/>
+        </w:rPr>
         <w:t xml:space="preserve">•</w:t>
       </w:r>
       <w:r>
@@ -1429,6 +1435,9 @@
         <w:ind w:left="420" w:hanging="210"/>
       </w:pPr>
       <w:r>
+        <w:rPr>
+          <w:rFonts w:ascii="Times New Roman" w:hAnsi="Times New Roman" w:cs="Times New Roman"/>
+        </w:rPr>
         <w:t xml:space="preserve">•</w:t>
       </w:r>
       <w:r>
@@ -1453,6 +1462,9 @@
         <w:ind w:left="420" w:hanging="210"/>
       </w:pPr>
       <w:r>
+        <w:rPr>
+          <w:rFonts w:ascii="Times New Roman" w:hAnsi="Times New Roman" w:cs="Times New Roman"/>
+        </w:rPr>
         <w:t xml:space="preserve">•</w:t>
       </w:r>
       <w:r>
@@ -1590,9 +1602,9 @@
         </w:tblCellMar>
       </w:tblPr>
       <w:tblGrid>
-        <w:gridCol w:w="1295"/>
-        <w:gridCol w:w="2185"/>
-        <w:gridCol w:w="6386"/>
+        <w:gridCol w:w="1293"/>
+        <w:gridCol w:w="2193"/>
+        <w:gridCol w:w="6380"/>
       </w:tblGrid>
       <w:tr>
         <w:trPr>
@@ -1601,7 +1613,7 @@
         </w:trPr>
         <w:tc>
           <w:tcPr>
-            <w:tcW w:w="1295" w:type="dxa"/>
+            <w:tcW w:w="1293" w:type="dxa"/>
             <w:shd w:val="clear" w:color="auto" w:fill="DCE6F1"/>
             <w:vAlign w:val="center"/>
           </w:tcPr>
@@ -1617,7 +1629,7 @@
         </w:tc>
         <w:tc>
           <w:tcPr>
-            <w:tcW w:w="2185" w:type="dxa"/>
+            <w:tcW w:w="2193" w:type="dxa"/>
             <w:shd w:val="clear" w:color="auto" w:fill="DCE6F1"/>
             <w:vAlign w:val="center"/>
           </w:tcPr>
@@ -1633,7 +1645,7 @@
         </w:tc>
         <w:tc>
           <w:tcPr>
-            <w:tcW w:w="6386" w:type="dxa"/>
+            <w:tcW w:w="6380" w:type="dxa"/>
             <w:shd w:val="clear" w:color="auto" w:fill="DCE6F1"/>
             <w:vAlign w:val="center"/>
           </w:tcPr>
@@ -1654,7 +1666,7 @@
         </w:trPr>
         <w:tc>
           <w:tcPr>
-            <w:tcW w:w="1295" w:type="dxa"/>
+            <w:tcW w:w="1293" w:type="dxa"/>
             <w:vAlign w:val="center"/>
           </w:tcPr>
           <w:p>
@@ -1669,7 +1681,7 @@
         </w:tc>
         <w:tc>
           <w:tcPr>
-            <w:tcW w:w="2185" w:type="dxa"/>
+            <w:tcW w:w="2193" w:type="dxa"/>
             <w:vAlign w:val="center"/>
           </w:tcPr>
           <w:p>
@@ -1684,7 +1696,7 @@
         </w:tc>
         <w:tc>
           <w:tcPr>
-            <w:tcW w:w="6386" w:type="dxa"/>
+            <w:tcW w:w="6380" w:type="dxa"/>
             <w:vAlign w:val="center"/>
           </w:tcPr>
           <w:p>
@@ -1704,7 +1716,7 @@
         </w:trPr>
         <w:tc>
           <w:tcPr>
-            <w:tcW w:w="1295" w:type="dxa"/>
+            <w:tcW w:w="1293" w:type="dxa"/>
             <w:vAlign w:val="center"/>
           </w:tcPr>
           <w:p>
@@ -1719,7 +1731,7 @@
         </w:tc>
         <w:tc>
           <w:tcPr>
-            <w:tcW w:w="2185" w:type="dxa"/>
+            <w:tcW w:w="2193" w:type="dxa"/>
             <w:vAlign w:val="center"/>
           </w:tcPr>
           <w:p>
@@ -1734,7 +1746,7 @@
         </w:tc>
         <w:tc>
           <w:tcPr>
-            <w:tcW w:w="6386" w:type="dxa"/>
+            <w:tcW w:w="6380" w:type="dxa"/>
             <w:vAlign w:val="center"/>
           </w:tcPr>
           <w:p>
@@ -1754,7 +1766,7 @@
         </w:trPr>
         <w:tc>
           <w:tcPr>
-            <w:tcW w:w="1295" w:type="dxa"/>
+            <w:tcW w:w="1293" w:type="dxa"/>
             <w:vAlign w:val="center"/>
           </w:tcPr>
           <w:p>
@@ -1769,7 +1781,7 @@
         </w:tc>
         <w:tc>
           <w:tcPr>
-            <w:tcW w:w="2185" w:type="dxa"/>
+            <w:tcW w:w="2193" w:type="dxa"/>
             <w:vAlign w:val="center"/>
           </w:tcPr>
           <w:p>
@@ -1784,7 +1796,7 @@
         </w:tc>
         <w:tc>
           <w:tcPr>
-            <w:tcW w:w="6386" w:type="dxa"/>
+            <w:tcW w:w="6380" w:type="dxa"/>
             <w:vAlign w:val="center"/>
           </w:tcPr>
           <w:p>
@@ -1804,7 +1816,7 @@
         </w:trPr>
         <w:tc>
           <w:tcPr>
-            <w:tcW w:w="1295" w:type="dxa"/>
+            <w:tcW w:w="1293" w:type="dxa"/>
             <w:vAlign w:val="center"/>
           </w:tcPr>
           <w:p>
@@ -1819,7 +1831,7 @@
         </w:tc>
         <w:tc>
           <w:tcPr>
-            <w:tcW w:w="2185" w:type="dxa"/>
+            <w:tcW w:w="2193" w:type="dxa"/>
             <w:vAlign w:val="center"/>
           </w:tcPr>
           <w:p>
@@ -1834,7 +1846,7 @@
         </w:tc>
         <w:tc>
           <w:tcPr>
-            <w:tcW w:w="6386" w:type="dxa"/>
+            <w:tcW w:w="6380" w:type="dxa"/>
             <w:vAlign w:val="center"/>
           </w:tcPr>
           <w:p>
@@ -1854,7 +1866,7 @@
         </w:trPr>
         <w:tc>
           <w:tcPr>
-            <w:tcW w:w="1295" w:type="dxa"/>
+            <w:tcW w:w="1293" w:type="dxa"/>
             <w:vAlign w:val="center"/>
           </w:tcPr>
           <w:p>
@@ -1869,7 +1881,7 @@
         </w:tc>
         <w:tc>
           <w:tcPr>
-            <w:tcW w:w="2185" w:type="dxa"/>
+            <w:tcW w:w="2193" w:type="dxa"/>
             <w:vAlign w:val="center"/>
           </w:tcPr>
           <w:p>
@@ -1884,7 +1896,7 @@
         </w:tc>
         <w:tc>
           <w:tcPr>
-            <w:tcW w:w="6386" w:type="dxa"/>
+            <w:tcW w:w="6380" w:type="dxa"/>
             <w:vAlign w:val="center"/>
           </w:tcPr>
           <w:p>
@@ -1904,7 +1916,7 @@
         </w:trPr>
         <w:tc>
           <w:tcPr>
-            <w:tcW w:w="1295" w:type="dxa"/>
+            <w:tcW w:w="1293" w:type="dxa"/>
             <w:vAlign w:val="center"/>
           </w:tcPr>
           <w:p>
@@ -1919,7 +1931,7 @@
         </w:tc>
         <w:tc>
           <w:tcPr>
-            <w:tcW w:w="2185" w:type="dxa"/>
+            <w:tcW w:w="2193" w:type="dxa"/>
             <w:vAlign w:val="center"/>
           </w:tcPr>
           <w:p>
@@ -1934,7 +1946,7 @@
         </w:tc>
         <w:tc>
           <w:tcPr>
-            <w:tcW w:w="6386" w:type="dxa"/>
+            <w:tcW w:w="6380" w:type="dxa"/>
             <w:vAlign w:val="center"/>
           </w:tcPr>
           <w:p>
@@ -1954,7 +1966,7 @@
         </w:trPr>
         <w:tc>
           <w:tcPr>
-            <w:tcW w:w="1295" w:type="dxa"/>
+            <w:tcW w:w="1293" w:type="dxa"/>
             <w:vAlign w:val="center"/>
           </w:tcPr>
           <w:p>
@@ -1969,7 +1981,7 @@
         </w:tc>
         <w:tc>
           <w:tcPr>
-            <w:tcW w:w="2185" w:type="dxa"/>
+            <w:tcW w:w="2193" w:type="dxa"/>
             <w:vAlign w:val="center"/>
           </w:tcPr>
           <w:p>
@@ -1984,7 +1996,7 @@
         </w:tc>
         <w:tc>
           <w:tcPr>
-            <w:tcW w:w="6386" w:type="dxa"/>
+            <w:tcW w:w="6380" w:type="dxa"/>
             <w:vAlign w:val="center"/>
           </w:tcPr>
           <w:p>
@@ -2004,7 +2016,7 @@
         </w:trPr>
         <w:tc>
           <w:tcPr>
-            <w:tcW w:w="1295" w:type="dxa"/>
+            <w:tcW w:w="1293" w:type="dxa"/>
             <w:vAlign w:val="center"/>
           </w:tcPr>
           <w:p>
@@ -2019,7 +2031,7 @@
         </w:tc>
         <w:tc>
           <w:tcPr>
-            <w:tcW w:w="2185" w:type="dxa"/>
+            <w:tcW w:w="2193" w:type="dxa"/>
             <w:vAlign w:val="center"/>
           </w:tcPr>
           <w:p>
@@ -2034,7 +2046,7 @@
         </w:tc>
         <w:tc>
           <w:tcPr>
-            <w:tcW w:w="6386" w:type="dxa"/>
+            <w:tcW w:w="6380" w:type="dxa"/>
             <w:vAlign w:val="center"/>
           </w:tcPr>
           <w:p>
@@ -2054,7 +2066,7 @@
         </w:trPr>
         <w:tc>
           <w:tcPr>
-            <w:tcW w:w="1295" w:type="dxa"/>
+            <w:tcW w:w="1293" w:type="dxa"/>
             <w:vAlign w:val="center"/>
           </w:tcPr>
           <w:p>
@@ -2069,22 +2081,22 @@
         </w:tc>
         <w:tc>
           <w:tcPr>
-            <w:tcW w:w="2185" w:type="dxa"/>
-            <w:vAlign w:val="center"/>
-          </w:tcPr>
-          <w:p>
-            <w:pPr>
-              <w:pStyle w:val="TableText"/>
-              <w:jc w:val="left"/>
-            </w:pPr>
-            <w:r>
-              <w:t xml:space="preserve">tests/、benchmarks/</w:t>
-            </w:r>
-          </w:p>
-        </w:tc>
-        <w:tc>
-          <w:tcPr>
-            <w:tcW w:w="6386" w:type="dxa"/>
+            <w:tcW w:w="2193" w:type="dxa"/>
+            <w:vAlign w:val="center"/>
+          </w:tcPr>
+          <w:p>
+            <w:pPr>
+              <w:pStyle w:val="TableText"/>
+              <w:jc w:val="left"/>
+            </w:pPr>
+            <w:r>
+              <w:t xml:space="preserve">tests/ &amp; benchmarks/</w:t>
+            </w:r>
+          </w:p>
+        </w:tc>
+        <w:tc>
+          <w:tcPr>
+            <w:tcW w:w="6380" w:type="dxa"/>
             <w:vAlign w:val="center"/>
           </w:tcPr>
           <w:p>
@@ -2483,7 +2495,7 @@
         <w:t xml:space="preserve">并非单向流水线</w:t>
       </w:r>
       <w:r>
-        <w:t xml:space="preserve">：环节 ③ 的偏好抽取与环节 ④ 的生命周期晋升是两条并行路径，前者让结构化偏好即时生效，后者保证知识与未结构化文本仍受质量门与热度门约束。</w:t>
+        <w:t xml:space="preserve">：环节 3 的偏好抽取与环节 4 的生命周期晋升是两条并行路径，前者让结构化偏好即时生效，后者保证知识与未结构化文本仍受质量门与热度门约束。</w:t>
       </w:r>
     </w:p>
     <w:p>
@@ -2565,6 +2577,9 @@
         <w:ind w:left="480" w:hanging="270"/>
       </w:pPr>
       <w:r>
+        <w:rPr>
+          <w:rFonts w:ascii="Times New Roman" w:hAnsi="Times New Roman" w:cs="Times New Roman"/>
+        </w:rPr>
         <w:t xml:space="preserve">1.</w:t>
       </w:r>
       <w:r>
@@ -2594,6 +2609,9 @@
         <w:ind w:left="480" w:hanging="270"/>
       </w:pPr>
       <w:r>
+        <w:rPr>
+          <w:rFonts w:ascii="Times New Roman" w:hAnsi="Times New Roman" w:cs="Times New Roman"/>
+        </w:rPr>
         <w:t xml:space="preserve">2.</w:t>
       </w:r>
       <w:r>
@@ -2618,6 +2636,9 @@
         <w:ind w:left="480" w:hanging="270"/>
       </w:pPr>
       <w:r>
+        <w:rPr>
+          <w:rFonts w:ascii="Times New Roman" w:hAnsi="Times New Roman" w:cs="Times New Roman"/>
+        </w:rPr>
         <w:t xml:space="preserve">3.</w:t>
       </w:r>
       <w:r>
@@ -2645,6 +2666,9 @@
         <w:ind w:left="480" w:hanging="270"/>
       </w:pPr>
       <w:r>
+        <w:rPr>
+          <w:rFonts w:ascii="Times New Roman" w:hAnsi="Times New Roman" w:cs="Times New Roman"/>
+        </w:rPr>
         <w:t xml:space="preserve">4.</w:t>
       </w:r>
       <w:r>
@@ -2680,6 +2704,9 @@
         <w:ind w:left="480" w:hanging="270"/>
       </w:pPr>
       <w:r>
+        <w:rPr>
+          <w:rFonts w:ascii="Times New Roman" w:hAnsi="Times New Roman" w:cs="Times New Roman"/>
+        </w:rPr>
         <w:t xml:space="preserve">5.</w:t>
       </w:r>
       <w:r>
@@ -3862,6 +3889,9 @@
         <w:ind w:left="420" w:hanging="210"/>
       </w:pPr>
       <w:r>
+        <w:rPr>
+          <w:rFonts w:ascii="Times New Roman" w:hAnsi="Times New Roman" w:cs="Times New Roman"/>
+        </w:rPr>
         <w:t xml:space="preserve">•</w:t>
       </w:r>
       <w:r>
@@ -3886,6 +3916,9 @@
         <w:ind w:left="420" w:hanging="210"/>
       </w:pPr>
       <w:r>
+        <w:rPr>
+          <w:rFonts w:ascii="Times New Roman" w:hAnsi="Times New Roman" w:cs="Times New Roman"/>
+        </w:rPr>
         <w:t xml:space="preserve">•</w:t>
       </w:r>
       <w:r>
@@ -3910,6 +3943,9 @@
         <w:ind w:left="420" w:hanging="210"/>
       </w:pPr>
       <w:r>
+        <w:rPr>
+          <w:rFonts w:ascii="Times New Roman" w:hAnsi="Times New Roman" w:cs="Times New Roman"/>
+        </w:rPr>
         <w:t xml:space="preserve">•</w:t>
       </w:r>
       <w:r>
@@ -3934,6 +3970,9 @@
         <w:ind w:left="420" w:hanging="210"/>
       </w:pPr>
       <w:r>
+        <w:rPr>
+          <w:rFonts w:ascii="Times New Roman" w:hAnsi="Times New Roman" w:cs="Times New Roman"/>
+        </w:rPr>
         <w:t xml:space="preserve">•</w:t>
       </w:r>
       <w:r>
@@ -5683,6 +5722,9 @@
         <w:ind w:left="420" w:hanging="210"/>
       </w:pPr>
       <w:r>
+        <w:rPr>
+          <w:rFonts w:ascii="Times New Roman" w:hAnsi="Times New Roman" w:cs="Times New Roman"/>
+        </w:rPr>
         <w:t xml:space="preserve">•</w:t>
       </w:r>
       <w:r>
@@ -5707,6 +5749,9 @@
         <w:ind w:left="420" w:hanging="210"/>
       </w:pPr>
       <w:r>
+        <w:rPr>
+          <w:rFonts w:ascii="Times New Roman" w:hAnsi="Times New Roman" w:cs="Times New Roman"/>
+        </w:rPr>
         <w:t xml:space="preserve">•</w:t>
       </w:r>
       <w:r>
@@ -5731,6 +5776,9 @@
         <w:ind w:left="420" w:hanging="210"/>
       </w:pPr>
       <w:r>
+        <w:rPr>
+          <w:rFonts w:ascii="Times New Roman" w:hAnsi="Times New Roman" w:cs="Times New Roman"/>
+        </w:rPr>
         <w:t xml:space="preserve">•</w:t>
       </w:r>
       <w:r>
@@ -5755,6 +5803,9 @@
         <w:ind w:left="420" w:hanging="210"/>
       </w:pPr>
       <w:r>
+        <w:rPr>
+          <w:rFonts w:ascii="Times New Roman" w:hAnsi="Times New Roman" w:cs="Times New Roman"/>
+        </w:rPr>
         <w:t xml:space="preserve">•</w:t>
       </w:r>
       <w:r>
@@ -5779,6 +5830,9 @@
         <w:ind w:left="420" w:hanging="210"/>
       </w:pPr>
       <w:r>
+        <w:rPr>
+          <w:rFonts w:ascii="Times New Roman" w:hAnsi="Times New Roman" w:cs="Times New Roman"/>
+        </w:rPr>
         <w:t xml:space="preserve">•</w:t>
       </w:r>
       <w:r>
@@ -6326,7 +6380,7 @@
               <w:t xml:space="preserve">general</w:t>
             </w:r>
             <w:r>
-              <w:t xml:space="preserve"> 与固化候选使用的 </w:t>
+              <w:t xml:space="preserve"> 与长期化候选使用的 </w:t>
             </w:r>
             <w:r>
               <w:rPr>
@@ -6978,7 +7032,7 @@
               <w:pStyle w:val="Note"/>
             </w:pPr>
             <w:r>
-              <w:t xml:space="preserve">边界说明：封闭键空间在开放域自由表达上覆盖有限。实测中开放域偏好抽测只有20% 样本正确率；两项数字口径不同，详见 9.7 节，不可互相替代。</w:t>
+              <w:t xml:space="preserve">范围说明：封闭键空间在开放域自由表达上覆盖有限。实测中开放域偏好抽测只有20% 样本正确率；两项数字口径不同，详见 9.7 节，不可互相替代。</w:t>
             </w:r>
           </w:p>
           <w:p>
@@ -7960,7 +8014,7 @@
               <w:t xml:space="preserve">preference_value</w:t>
             </w:r>
             <w:r>
-              <w:t xml:space="preserve"> 过滤、空表达式退化为不过滤两类边界固化为断言，避免后续维护者误以为是实现缺陷而随意修改语义。</w:t>
+              <w:t xml:space="preserve"> 过滤、空表达式退化为不过滤两类临界情况固定为断言，避免后续维护者误以为是实现缺陷而随意修改语义。</w:t>
             </w:r>
           </w:p>
           <w:p>
@@ -7998,6 +8052,9 @@
         <w:ind w:left="420" w:hanging="210"/>
       </w:pPr>
       <w:r>
+        <w:rPr>
+          <w:rFonts w:ascii="Times New Roman" w:hAnsi="Times New Roman" w:cs="Times New Roman"/>
+        </w:rPr>
         <w:t xml:space="preserve">•</w:t>
       </w:r>
       <w:r>
@@ -8022,6 +8079,9 @@
         <w:ind w:left="420" w:hanging="210"/>
       </w:pPr>
       <w:r>
+        <w:rPr>
+          <w:rFonts w:ascii="Times New Roman" w:hAnsi="Times New Roman" w:cs="Times New Roman"/>
+        </w:rPr>
         <w:t xml:space="preserve">•</w:t>
       </w:r>
       <w:r>
@@ -8046,6 +8106,9 @@
         <w:ind w:left="420" w:hanging="210"/>
       </w:pPr>
       <w:r>
+        <w:rPr>
+          <w:rFonts w:ascii="Times New Roman" w:hAnsi="Times New Roman" w:cs="Times New Roman"/>
+        </w:rPr>
         <w:t xml:space="preserve">•</w:t>
       </w:r>
       <w:r>
@@ -8106,7 +8169,7 @@
               <w:pStyle w:val="Note"/>
             </w:pPr>
             <w:r>
-              <w:t xml:space="preserve">边界说明：冲突消解器</w:t>
+              <w:t xml:space="preserve">范围说明：冲突消解器</w:t>
             </w:r>
             <w:r>
               <w:rPr>
@@ -8220,6 +8283,9 @@
         <w:ind w:left="480" w:hanging="270"/>
       </w:pPr>
       <w:r>
+        <w:rPr>
+          <w:rFonts w:ascii="Times New Roman" w:hAnsi="Times New Roman" w:cs="Times New Roman"/>
+        </w:rPr>
         <w:t xml:space="preserve">1.</w:t>
       </w:r>
       <w:r>
@@ -8244,6 +8310,9 @@
         <w:ind w:left="480" w:hanging="270"/>
       </w:pPr>
       <w:r>
+        <w:rPr>
+          <w:rFonts w:ascii="Times New Roman" w:hAnsi="Times New Roman" w:cs="Times New Roman"/>
+        </w:rPr>
         <w:t xml:space="preserve">2.</w:t>
       </w:r>
       <w:r>
@@ -8268,6 +8337,9 @@
         <w:ind w:left="480" w:hanging="270"/>
       </w:pPr>
       <w:r>
+        <w:rPr>
+          <w:rFonts w:ascii="Times New Roman" w:hAnsi="Times New Roman" w:cs="Times New Roman"/>
+        </w:rPr>
         <w:t xml:space="preserve">3.</w:t>
       </w:r>
       <w:r>
@@ -8522,7 +8594,7 @@
               <w:jc w:val="left"/>
             </w:pPr>
             <w:r>
-              <w:t xml:space="preserve">低信任埋点不会改写权威知识；代价是实体级合并尚未落地，当前仍有 4 项知识检索用例未通过（见 9.3.2）</w:t>
+              <w:t xml:space="preserve">低信任埋点不会改写权威知识；代价是实体级合并尚未实现，当前仍有 4 项知识检索用例未通过（见 9.3.2）</w:t>
             </w:r>
           </w:p>
         </w:tc>
@@ -9101,6 +9173,9 @@
         <w:ind w:left="420" w:hanging="210"/>
       </w:pPr>
       <w:r>
+        <w:rPr>
+          <w:rFonts w:ascii="Times New Roman" w:hAnsi="Times New Roman" w:cs="Times New Roman"/>
+        </w:rPr>
         <w:t xml:space="preserve">•</w:t>
       </w:r>
       <w:r>
@@ -9125,6 +9200,9 @@
         <w:ind w:left="420" w:hanging="210"/>
       </w:pPr>
       <w:r>
+        <w:rPr>
+          <w:rFonts w:ascii="Times New Roman" w:hAnsi="Times New Roman" w:cs="Times New Roman"/>
+        </w:rPr>
         <w:t xml:space="preserve">•</w:t>
       </w:r>
       <w:r>
@@ -9149,6 +9227,9 @@
         <w:ind w:left="420" w:hanging="210"/>
       </w:pPr>
       <w:r>
+        <w:rPr>
+          <w:rFonts w:ascii="Times New Roman" w:hAnsi="Times New Roman" w:cs="Times New Roman"/>
+        </w:rPr>
         <w:t xml:space="preserve">•</w:t>
       </w:r>
       <w:r>
@@ -9173,6 +9254,9 @@
         <w:ind w:left="420" w:hanging="210"/>
       </w:pPr>
       <w:r>
+        <w:rPr>
+          <w:rFonts w:ascii="Times New Roman" w:hAnsi="Times New Roman" w:cs="Times New Roman"/>
+        </w:rPr>
         <w:t xml:space="preserve">•</w:t>
       </w:r>
       <w:r>
@@ -9199,6 +9283,14 @@
     <w:p>
       <w:r>
         <w:t xml:space="preserve">同一套代码支持三种运行形态，差异只在适配层与配置，业务逻辑完全一致：</w:t>
+      </w:r>
+    </w:p>
+    <w:p>
+      <w:pPr>
+        <w:pStyle w:val="TableCaption"/>
+      </w:pPr>
+      <w:r>
+        <w:t xml:space="preserve">表 6-1  三种运行形态的对照</w:t>
       </w:r>
     </w:p>
     <w:tbl>
@@ -9553,14 +9645,6 @@
       </w:pPr>
       <w:r>
         <w:t/>
-      </w:r>
-    </w:p>
-    <w:p>
-      <w:pPr>
-        <w:pStyle w:val="Caption"/>
-      </w:pPr>
-      <w:r>
-        <w:t xml:space="preserve">表 6-1  三种运行形态的对照</w:t>
       </w:r>
     </w:p>
     <w:p>
@@ -10413,7 +10497,7 @@
               <w:pStyle w:val="Note"/>
             </w:pPr>
             <w:r>
-              <w:t xml:space="preserve">防误脱敏设计：执行每条规则前，先用哨兵符把已有占位符保护起来，避免数字类规则把占位符内的十六进制数字段二次识别为敏感内容。该问题在早期版本中真实出现过，现已通过哨兵机制与回归测试固化。</w:t>
+              <w:t xml:space="preserve">防误脱敏设计：执行每条规则前，先用哨兵符把已有占位符保护起来，避免数字类规则把占位符内的十六进制数字段二次识别为敏感内容。该问题在早期版本中真实出现过，现已通过哨兵机制与回归测试固定。</w:t>
             </w:r>
           </w:p>
           <w:p>
@@ -10761,6 +10845,9 @@
         <w:ind w:left="420" w:hanging="210"/>
       </w:pPr>
       <w:r>
+        <w:rPr>
+          <w:rFonts w:ascii="Times New Roman" w:hAnsi="Times New Roman" w:cs="Times New Roman"/>
+        </w:rPr>
         <w:t xml:space="preserve">•</w:t>
       </w:r>
       <w:r>
@@ -10788,6 +10875,9 @@
         <w:ind w:left="420" w:hanging="210"/>
       </w:pPr>
       <w:r>
+        <w:rPr>
+          <w:rFonts w:ascii="Times New Roman" w:hAnsi="Times New Roman" w:cs="Times New Roman"/>
+        </w:rPr>
         <w:t xml:space="preserve">•</w:t>
       </w:r>
       <w:r>
@@ -10806,6 +10896,9 @@
         <w:ind w:left="420" w:hanging="210"/>
       </w:pPr>
       <w:r>
+        <w:rPr>
+          <w:rFonts w:ascii="Times New Roman" w:hAnsi="Times New Roman" w:cs="Times New Roman"/>
+        </w:rPr>
         <w:t xml:space="preserve">•</w:t>
       </w:r>
       <w:r>
@@ -10833,6 +10926,9 @@
         <w:ind w:left="420" w:hanging="210"/>
       </w:pPr>
       <w:r>
+        <w:rPr>
+          <w:rFonts w:ascii="Times New Roman" w:hAnsi="Times New Roman" w:cs="Times New Roman"/>
+        </w:rPr>
         <w:t xml:space="preserve">•</w:t>
       </w:r>
       <w:r>
@@ -11240,6 +11336,9 @@
         <w:ind w:left="480" w:hanging="270"/>
       </w:pPr>
       <w:r>
+        <w:rPr>
+          <w:rFonts w:ascii="Times New Roman" w:hAnsi="Times New Roman" w:cs="Times New Roman"/>
+        </w:rPr>
         <w:t xml:space="preserve">1.</w:t>
       </w:r>
       <w:r>
@@ -11264,6 +11363,9 @@
         <w:ind w:left="480" w:hanging="270"/>
       </w:pPr>
       <w:r>
+        <w:rPr>
+          <w:rFonts w:ascii="Times New Roman" w:hAnsi="Times New Roman" w:cs="Times New Roman"/>
+        </w:rPr>
         <w:t xml:space="preserve">2.</w:t>
       </w:r>
       <w:r>
@@ -11288,6 +11390,9 @@
         <w:ind w:left="480" w:hanging="270"/>
       </w:pPr>
       <w:r>
+        <w:rPr>
+          <w:rFonts w:ascii="Times New Roman" w:hAnsi="Times New Roman" w:cs="Times New Roman"/>
+        </w:rPr>
         <w:t xml:space="preserve">3.</w:t>
       </w:r>
       <w:r>
@@ -11312,6 +11417,9 @@
         <w:ind w:left="480" w:hanging="270"/>
       </w:pPr>
       <w:r>
+        <w:rPr>
+          <w:rFonts w:ascii="Times New Roman" w:hAnsi="Times New Roman" w:cs="Times New Roman"/>
+        </w:rPr>
         <w:t xml:space="preserve">4.</w:t>
       </w:r>
       <w:r>
@@ -12299,6 +12407,14 @@
         <w:t xml:space="preserve">图 8-1  记忆流转与短/中期交互逻辑</w:t>
       </w:r>
     </w:p>
+    <w:p>
+      <w:pPr>
+        <w:pStyle w:val="TableCaption"/>
+      </w:pPr>
+      <w:r>
+        <w:t xml:space="preserve">表 8-1  三个记忆层的交互职责划分</w:t>
+      </w:r>
+    </w:p>
     <w:tbl>
       <w:tblPr>
         <w:tblStyle w:val="GridTable"/>
@@ -12447,7 +12563,7 @@
               <w:jc w:val="left"/>
             </w:pPr>
             <w:r>
-              <w:t xml:space="preserve">仅由固化流程写入，不接受直接写入</w:t>
+              <w:t xml:space="preserve">仅由长期化流程写入，不接受直接写入</w:t>
             </w:r>
           </w:p>
         </w:tc>
@@ -12790,14 +12906,6 @@
       </w:pPr>
       <w:r>
         <w:t/>
-      </w:r>
-    </w:p>
-    <w:p>
-      <w:pPr>
-        <w:pStyle w:val="Caption"/>
-      </w:pPr>
-      <w:r>
-        <w:t xml:space="preserve">表 8-1  三个记忆层的交互职责划分</w:t>
       </w:r>
     </w:p>
     <w:p>
@@ -12814,6 +12922,9 @@
         <w:ind w:left="480" w:hanging="270"/>
       </w:pPr>
       <w:r>
+        <w:rPr>
+          <w:rFonts w:ascii="Times New Roman" w:hAnsi="Times New Roman" w:cs="Times New Roman"/>
+        </w:rPr>
         <w:t xml:space="preserve">1.</w:t>
       </w:r>
       <w:r>
@@ -12838,6 +12949,9 @@
         <w:ind w:left="480" w:hanging="270"/>
       </w:pPr>
       <w:r>
+        <w:rPr>
+          <w:rFonts w:ascii="Times New Roman" w:hAnsi="Times New Roman" w:cs="Times New Roman"/>
+        </w:rPr>
         <w:t xml:space="preserve">2.</w:t>
       </w:r>
       <w:r>
@@ -12862,6 +12976,9 @@
         <w:ind w:left="480" w:hanging="270"/>
       </w:pPr>
       <w:r>
+        <w:rPr>
+          <w:rFonts w:ascii="Times New Roman" w:hAnsi="Times New Roman" w:cs="Times New Roman"/>
+        </w:rPr>
         <w:t xml:space="preserve">3.</w:t>
       </w:r>
       <w:r>
@@ -12891,7 +13008,7 @@
         <w:pStyle w:val="Heading2"/>
       </w:pPr>
       <w:r>
-        <w:t xml:space="preserve">8.3  热度模型与固化</w:t>
+        <w:t xml:space="preserve">8.3  热度模型与长期化</w:t>
       </w:r>
     </w:p>
     <w:p>
@@ -12923,12 +13040,12 @@
         <w:t xml:space="preserve">距离晋升仅差一次访问</w:t>
       </w:r>
       <w:r>
-        <w:t xml:space="preserve">。若不显式触发访问计数，知识类记忆会长期停留在短期层而无法进入检索范围。工程上通过检索接口的访问计数与显式触达接口解决，并在验收脚本中固化了「先触达再固化」的标准流程。</w:t>
-      </w:r>
-    </w:p>
-    <w:p>
-      <w:r>
-        <w:t xml:space="preserve">中期到长期的固化引入两项语义增强：</w:t>
+        <w:t xml:space="preserve">。若不显式触发访问计数，知识类记忆会长期停留在短期层而无法进入检索范围。工程上通过检索接口的访问计数与显式触达接口解决，并在验收脚本中固定了「先触达再长期化」的标准流程。</w:t>
+      </w:r>
+    </w:p>
+    <w:p>
+      <w:r>
+        <w:t xml:space="preserve">中期转入长期时有两项语义增强：</w:t>
       </w:r>
     </w:p>
     <w:p>
@@ -12940,6 +13057,9 @@
         <w:ind w:left="420" w:hanging="210"/>
       </w:pPr>
       <w:r>
+        <w:rPr>
+          <w:rFonts w:ascii="Times New Roman" w:hAnsi="Times New Roman" w:cs="Times New Roman"/>
+        </w:rPr>
         <w:t xml:space="preserve">•</w:t>
       </w:r>
       <w:r>
@@ -12973,6 +13093,9 @@
         <w:ind w:left="420" w:hanging="210"/>
       </w:pPr>
       <w:r>
+        <w:rPr>
+          <w:rFonts w:ascii="Times New Roman" w:hAnsi="Times New Roman" w:cs="Times New Roman"/>
+        </w:rPr>
         <w:t xml:space="preserve">•</w:t>
       </w:r>
       <w:r>
@@ -12985,7 +13108,7 @@
         <w:t xml:space="preserve">抽象提炼</w:t>
       </w:r>
       <w:r>
-        <w:t xml:space="preserve">：对中期碎片做抽象提炼后再写入长期层，使跨对话合并后的稳定陈述被提炼而非原样搬运。该能力可选用本地模型增强，默认关闭以避免每次固化都调用模型。</w:t>
+        <w:t xml:space="preserve">：对中期碎片做抽象提炼后再写入长期层，使跨对话合并后的稳定陈述被提炼而非原样搬运。该能力可选用本地模型增强，默认关闭以避免每次长期化都调用模型。</w:t>
       </w:r>
     </w:p>
     <w:p>
@@ -13112,6 +13235,9 @@
         <w:ind w:left="480" w:hanging="270"/>
       </w:pPr>
       <w:r>
+        <w:rPr>
+          <w:rFonts w:ascii="Times New Roman" w:hAnsi="Times New Roman" w:cs="Times New Roman"/>
+        </w:rPr>
         <w:t xml:space="preserve">1.</w:t>
       </w:r>
       <w:r>
@@ -13136,6 +13262,9 @@
         <w:ind w:left="480" w:hanging="270"/>
       </w:pPr>
       <w:r>
+        <w:rPr>
+          <w:rFonts w:ascii="Times New Roman" w:hAnsi="Times New Roman" w:cs="Times New Roman"/>
+        </w:rPr>
         <w:t xml:space="preserve">2.</w:t>
       </w:r>
       <w:r>
@@ -13160,6 +13289,9 @@
         <w:ind w:left="480" w:hanging="270"/>
       </w:pPr>
       <w:r>
+        <w:rPr>
+          <w:rFonts w:ascii="Times New Roman" w:hAnsi="Times New Roman" w:cs="Times New Roman"/>
+        </w:rPr>
         <w:t xml:space="preserve">3.</w:t>
       </w:r>
       <w:r>
@@ -13169,10 +13301,10 @@
         <w:rPr>
           <w:b/>
         </w:rPr>
-        <w:t xml:space="preserve">已晋升内容不重复固化</w:t>
-      </w:r>
-      <w:r>
-        <w:t xml:space="preserve">：晋升后原层的条目状态被正确标记，避免同一内容在多轮固化中产生副本。</w:t>
+        <w:t xml:space="preserve">已晋升内容不重复长期化</w:t>
+      </w:r>
+      <w:r>
+        <w:t xml:space="preserve">：晋升后原层的条目状态被正确标记，避免同一内容在多轮长期化中产生副本。</w:t>
       </w:r>
     </w:p>
     <w:p>
@@ -13180,7 +13312,7 @@
         <w:pStyle w:val="Heading2"/>
       </w:pPr>
       <w:r>
-        <w:t xml:space="preserve">8.5  机制创新点：记忆流转与固化</w:t>
+        <w:t xml:space="preserve">8.5  机制创新点：记忆流转与长期化</w:t>
       </w:r>
     </w:p>
     <w:tbl>
@@ -13416,7 +13548,7 @@
               <w:jc w:val="center"/>
             </w:pPr>
             <w:r>
-              <w:t xml:space="preserve">长期固化</w:t>
+              <w:t xml:space="preserve">长期化</w:t>
             </w:r>
           </w:p>
         </w:tc>
@@ -13632,7 +13764,7 @@
         <w:t xml:space="preserve">数据集性质与指标口径完全不同，因此分开陈述、互不混算</w:t>
       </w:r>
       <w:r>
-        <w:t xml:space="preserve">。这种划分方式本身也是对评审的诚实交代：前期验证「功能是否跑通」，后期验证「公开数据集上的指标水平」。</w:t>
+        <w:t xml:space="preserve">。这种划分方式本身也是对评审的如实说明：前期验证「功能是否跑通」，后期验证「公开数据集上的指标水平」。</w:t>
       </w:r>
     </w:p>
     <w:tbl>
@@ -14431,7 +14563,7 @@
               <w:jc w:val="left"/>
             </w:pPr>
             <w:r>
-              <w:t xml:space="preserve">短期到长期晋升、固化、进程重启后仍可召回</w:t>
+              <w:t xml:space="preserve">短期到长期晋升、长期化、进程重启后仍可召回</w:t>
             </w:r>
           </w:p>
         </w:tc>
@@ -14771,6 +14903,14 @@
       </w:pPr>
       <w:r>
         <w:t/>
+      </w:r>
+    </w:p>
+    <w:p>
+      <w:pPr>
+        <w:pStyle w:val="TableCaption"/>
+      </w:pPr>
+      <w:r>
+        <w:t xml:space="preserve">表 9-1  前期功能覆盖演示集分功能结果</w:t>
       </w:r>
     </w:p>
     <w:tbl>
@@ -15611,14 +15751,6 @@
       </w:pPr>
       <w:r>
         <w:t/>
-      </w:r>
-    </w:p>
-    <w:p>
-      <w:pPr>
-        <w:pStyle w:val="Caption"/>
-      </w:pPr>
-      <w:r>
-        <w:t xml:space="preserve">表 9-1  前期功能覆盖演示集分功能结果</w:t>
       </w:r>
     </w:p>
     <w:p>
@@ -16380,6 +16512,14 @@
         <w:t xml:space="preserve">沿用不同轮次的数字时随数字标明轮次，不横比。</w:t>
       </w:r>
     </w:p>
+    <w:p>
+      <w:pPr>
+        <w:pStyle w:val="TableCaption"/>
+      </w:pPr>
+      <w:r>
+        <w:t xml:space="preserve">表 9-2  后期公开数据集抽样结果</w:t>
+      </w:r>
+    </w:p>
     <w:tbl>
       <w:tblPr>
         <w:tblStyle w:val="GridTable"/>
@@ -17816,14 +17956,6 @@
       </w:pPr>
       <w:r>
         <w:t/>
-      </w:r>
-    </w:p>
-    <w:p>
-      <w:pPr>
-        <w:pStyle w:val="Caption"/>
-      </w:pPr>
-      <w:r>
-        <w:t xml:space="preserve">表 9-2  后期公开数据集抽样结果</w:t>
       </w:r>
     </w:p>
     <w:p>
@@ -19975,7 +20107,7 @@
               <w:t xml:space="preserve">词面口径仍为 0.6867 未达标</w:t>
             </w:r>
             <w:r>
-              <w:t xml:space="preserve">，且语义口径由模型裁判给出，不等价于人工标注；空样本误抽偏高（30 个空样本中 11 个被误判为含偏好，封闭键口径下为 0）。上述缺口均列入 9.7 节。</w:t>
+              <w:t xml:space="preserve">，且语义口径由模型裁判给出，不等价于人工标注；空样本误抽偏高（30 个空样本中 11 个被误判为含偏好，封闭键口径下为 0）。上述不足均列入 9.7 节。</w:t>
             </w:r>
           </w:p>
           <w:p>
@@ -21521,6 +21653,14 @@
         <w:t xml:space="preserve">。</w:t>
       </w:r>
     </w:p>
+    <w:p>
+      <w:pPr>
+        <w:pStyle w:val="TableCaption"/>
+      </w:pPr>
+      <w:r>
+        <w:t xml:space="preserve">表 9-3  银河麒麟 V11 真机验收结果</w:t>
+      </w:r>
+    </w:p>
     <w:tbl>
       <w:tblPr>
         <w:tblStyle w:val="GridTable"/>
@@ -21866,14 +22006,6 @@
     </w:p>
     <w:p>
       <w:pPr>
-        <w:pStyle w:val="Caption"/>
-      </w:pPr>
-      <w:r>
-        <w:t xml:space="preserve">表 9-3  银河麒麟 V11 真机验收结果</w:t>
-      </w:r>
-    </w:p>
-    <w:p>
-      <w:pPr>
         <w:pStyle w:val="Heading3"/>
       </w:pPr>
       <w:r>
@@ -21882,7 +22014,7 @@
     </w:p>
     <w:p>
       <w:r>
-        <w:t xml:space="preserve">真机部署过程中定位并固化为操作约束的环境问题：</w:t>
+        <w:t xml:space="preserve">真机部署过程中定位并固定为操作约束的环境问题：</w:t>
       </w:r>
     </w:p>
     <w:p>
@@ -21894,6 +22026,9 @@
         <w:ind w:left="480" w:hanging="270"/>
       </w:pPr>
       <w:r>
+        <w:rPr>
+          <w:rFonts w:ascii="Times New Roman" w:hAnsi="Times New Roman" w:cs="Times New Roman"/>
+        </w:rPr>
         <w:t xml:space="preserve">1.</w:t>
       </w:r>
       <w:r>
@@ -21918,6 +22053,9 @@
         <w:ind w:left="480" w:hanging="270"/>
       </w:pPr>
       <w:r>
+        <w:rPr>
+          <w:rFonts w:ascii="Times New Roman" w:hAnsi="Times New Roman" w:cs="Times New Roman"/>
+        </w:rPr>
         <w:t xml:space="preserve">2.</w:t>
       </w:r>
       <w:r>
@@ -21942,6 +22080,9 @@
         <w:ind w:left="480" w:hanging="270"/>
       </w:pPr>
       <w:r>
+        <w:rPr>
+          <w:rFonts w:ascii="Times New Roman" w:hAnsi="Times New Roman" w:cs="Times New Roman"/>
+        </w:rPr>
         <w:t xml:space="preserve">3.</w:t>
       </w:r>
       <w:r>
@@ -21966,6 +22107,9 @@
         <w:ind w:left="480" w:hanging="270"/>
       </w:pPr>
       <w:r>
+        <w:rPr>
+          <w:rFonts w:ascii="Times New Roman" w:hAnsi="Times New Roman" w:cs="Times New Roman"/>
+        </w:rPr>
         <w:t xml:space="preserve">4.</w:t>
       </w:r>
       <w:r>
@@ -21990,6 +22134,9 @@
         <w:ind w:left="480" w:hanging="270"/>
       </w:pPr>
       <w:r>
+        <w:rPr>
+          <w:rFonts w:ascii="Times New Roman" w:hAnsi="Times New Roman" w:cs="Times New Roman"/>
+        </w:rPr>
         <w:t xml:space="preserve">5.</w:t>
       </w:r>
       <w:r>
@@ -22014,6 +22161,9 @@
         <w:ind w:left="480" w:hanging="270"/>
       </w:pPr>
       <w:r>
+        <w:rPr>
+          <w:rFonts w:ascii="Times New Roman" w:hAnsi="Times New Roman" w:cs="Times New Roman"/>
+        </w:rPr>
         <w:t xml:space="preserve">6.</w:t>
       </w:r>
       <w:r>
@@ -22038,6 +22188,9 @@
         <w:ind w:left="480" w:hanging="270"/>
       </w:pPr>
       <w:r>
+        <w:rPr>
+          <w:rFonts w:ascii="Times New Roman" w:hAnsi="Times New Roman" w:cs="Times New Roman"/>
+        </w:rPr>
         <w:t xml:space="preserve">7.</w:t>
       </w:r>
       <w:r>
@@ -22246,7 +22399,7 @@
               <w:jc w:val="left"/>
             </w:pPr>
             <w:r>
-              <w:t xml:space="preserve">开放域抽取头已落地（语义口径 0.9 达标，见 9.3.5）；词面口径低源于中英表达鸿沟与键值化表达，提升需跨语言对齐，或改用语义裁判作对外口径并明确声明</w:t>
+              <w:t xml:space="preserve">开放域抽取头已实现（语义口径 0.9 达标，见 9.3.5）；词面口径低源于中英表达鸿沟与键值化表达，提升需跨语言对齐，或改用语义裁判作对外口径并明确声明</w:t>
             </w:r>
           </w:p>
         </w:tc>
@@ -22454,6 +22607,9 @@
         <w:ind w:left="420" w:hanging="210"/>
       </w:pPr>
       <w:r>
+        <w:rPr>
+          <w:rFonts w:ascii="Times New Roman" w:hAnsi="Times New Roman" w:cs="Times New Roman"/>
+        </w:rPr>
         <w:t xml:space="preserve">•</w:t>
       </w:r>
       <w:r>
@@ -22472,6 +22628,9 @@
         <w:ind w:left="420" w:hanging="210"/>
       </w:pPr>
       <w:r>
+        <w:rPr>
+          <w:rFonts w:ascii="Times New Roman" w:hAnsi="Times New Roman" w:cs="Times New Roman"/>
+        </w:rPr>
         <w:t xml:space="preserve">•</w:t>
       </w:r>
       <w:r>
@@ -22490,6 +22649,9 @@
         <w:ind w:left="420" w:hanging="210"/>
       </w:pPr>
       <w:r>
+        <w:rPr>
+          <w:rFonts w:ascii="Times New Roman" w:hAnsi="Times New Roman" w:cs="Times New Roman"/>
+        </w:rPr>
         <w:t xml:space="preserve">•</w:t>
       </w:r>
       <w:r>
@@ -22508,6 +22670,9 @@
         <w:ind w:left="420" w:hanging="210"/>
       </w:pPr>
       <w:r>
+        <w:rPr>
+          <w:rFonts w:ascii="Times New Roman" w:hAnsi="Times New Roman" w:cs="Times New Roman"/>
+        </w:rPr>
         <w:t xml:space="preserve">•</w:t>
       </w:r>
       <w:r>
@@ -22522,12 +22687,12 @@
         <w:pStyle w:val="Heading2"/>
       </w:pPr>
       <w:r>
-        <w:t xml:space="preserve">9.8  结果边界与诚实声明</w:t>
-      </w:r>
-    </w:p>
-    <w:p>
-      <w:r>
-        <w:t xml:space="preserve">以下边界声明随全部指标一并提交，避免结论被过度解读：</w:t>
+        <w:t xml:space="preserve">9.8  结果说明与适用范围</w:t>
+      </w:r>
+    </w:p>
+    <w:p>
+      <w:r>
+        <w:t xml:space="preserve">以下说明随全部指标一并提交，避免结论被过度解读：</w:t>
       </w:r>
     </w:p>
     <w:p>
@@ -22539,6 +22704,9 @@
         <w:ind w:left="420" w:hanging="210"/>
       </w:pPr>
       <w:r>
+        <w:rPr>
+          <w:rFonts w:ascii="Times New Roman" w:hAnsi="Times New Roman" w:cs="Times New Roman"/>
+        </w:rPr>
         <w:t xml:space="preserve">•</w:t>
       </w:r>
       <w:r>
@@ -22563,6 +22731,9 @@
         <w:ind w:left="420" w:hanging="210"/>
       </w:pPr>
       <w:r>
+        <w:rPr>
+          <w:rFonts w:ascii="Times New Roman" w:hAnsi="Times New Roman" w:cs="Times New Roman"/>
+        </w:rPr>
         <w:t xml:space="preserve">•</w:t>
       </w:r>
       <w:r>
@@ -22587,6 +22758,9 @@
         <w:ind w:left="420" w:hanging="210"/>
       </w:pPr>
       <w:r>
+        <w:rPr>
+          <w:rFonts w:ascii="Times New Roman" w:hAnsi="Times New Roman" w:cs="Times New Roman"/>
+        </w:rPr>
         <w:t xml:space="preserve">•</w:t>
       </w:r>
       <w:r>
@@ -22611,6 +22785,9 @@
         <w:ind w:left="420" w:hanging="210"/>
       </w:pPr>
       <w:r>
+        <w:rPr>
+          <w:rFonts w:ascii="Times New Roman" w:hAnsi="Times New Roman" w:cs="Times New Roman"/>
+        </w:rPr>
         <w:t xml:space="preserve">•</w:t>
       </w:r>
       <w:r>
@@ -22635,6 +22812,9 @@
         <w:ind w:left="420" w:hanging="210"/>
       </w:pPr>
       <w:r>
+        <w:rPr>
+          <w:rFonts w:ascii="Times New Roman" w:hAnsi="Times New Roman" w:cs="Times New Roman"/>
+        </w:rPr>
         <w:t xml:space="preserve">•</w:t>
       </w:r>
       <w:r>
@@ -22659,6 +22839,9 @@
         <w:ind w:left="420" w:hanging="210"/>
       </w:pPr>
       <w:r>
+        <w:rPr>
+          <w:rFonts w:ascii="Times New Roman" w:hAnsi="Times New Roman" w:cs="Times New Roman"/>
+        </w:rPr>
         <w:t xml:space="preserve">•</w:t>
       </w:r>
       <w:r>
@@ -22683,6 +22866,9 @@
         <w:ind w:left="420" w:hanging="210"/>
       </w:pPr>
       <w:r>
+        <w:rPr>
+          <w:rFonts w:ascii="Times New Roman" w:hAnsi="Times New Roman" w:cs="Times New Roman"/>
+        </w:rPr>
         <w:t xml:space="preserve">•</w:t>
       </w:r>
       <w:r>
@@ -22707,6 +22893,9 @@
         <w:ind w:left="420" w:hanging="210"/>
       </w:pPr>
       <w:r>
+        <w:rPr>
+          <w:rFonts w:ascii="Times New Roman" w:hAnsi="Times New Roman" w:cs="Times New Roman"/>
+        </w:rPr>
         <w:t xml:space="preserve">•</w:t>
       </w:r>
       <w:r>
@@ -22731,6 +22920,9 @@
         <w:ind w:left="420" w:hanging="210"/>
       </w:pPr>
       <w:r>
+        <w:rPr>
+          <w:rFonts w:ascii="Times New Roman" w:hAnsi="Times New Roman" w:cs="Times New Roman"/>
+        </w:rPr>
         <w:t xml:space="preserve">•</w:t>
       </w:r>
       <w:r>
@@ -22755,6 +22947,9 @@
         <w:ind w:left="420" w:hanging="210"/>
       </w:pPr>
       <w:r>
+        <w:rPr>
+          <w:rFonts w:ascii="Times New Roman" w:hAnsi="Times New Roman" w:cs="Times New Roman"/>
+        </w:rPr>
         <w:t xml:space="preserve">•</w:t>
       </w:r>
       <w:r>
@@ -22779,6 +22974,9 @@
         <w:ind w:left="420" w:hanging="210"/>
       </w:pPr>
       <w:r>
+        <w:rPr>
+          <w:rFonts w:ascii="Times New Roman" w:hAnsi="Times New Roman" w:cs="Times New Roman"/>
+        </w:rPr>
         <w:t xml:space="preserve">•</w:t>
       </w:r>
       <w:r>
@@ -25643,6 +25841,9 @@
         <w:ind w:left="480" w:hanging="270"/>
       </w:pPr>
       <w:r>
+        <w:rPr>
+          <w:rFonts w:ascii="Times New Roman" w:hAnsi="Times New Roman" w:cs="Times New Roman"/>
+        </w:rPr>
         <w:t xml:space="preserve">1.</w:t>
       </w:r>
       <w:r>
@@ -25661,6 +25862,9 @@
         <w:ind w:left="480" w:hanging="270"/>
       </w:pPr>
       <w:r>
+        <w:rPr>
+          <w:rFonts w:ascii="Times New Roman" w:hAnsi="Times New Roman" w:cs="Times New Roman"/>
+        </w:rPr>
         <w:t xml:space="preserve">2.</w:t>
       </w:r>
       <w:r>
@@ -25679,6 +25883,9 @@
         <w:ind w:left="480" w:hanging="270"/>
       </w:pPr>
       <w:r>
+        <w:rPr>
+          <w:rFonts w:ascii="Times New Roman" w:hAnsi="Times New Roman" w:cs="Times New Roman"/>
+        </w:rPr>
         <w:t xml:space="preserve">3.</w:t>
       </w:r>
       <w:r>
@@ -25861,6 +26068,9 @@
         <w:ind w:left="480" w:hanging="270"/>
       </w:pPr>
       <w:r>
+        <w:rPr>
+          <w:rFonts w:ascii="Times New Roman" w:hAnsi="Times New Roman" w:cs="Times New Roman"/>
+        </w:rPr>
         <w:t xml:space="preserve">1.</w:t>
       </w:r>
       <w:r>
@@ -25879,6 +26089,9 @@
         <w:ind w:left="480" w:hanging="270"/>
       </w:pPr>
       <w:r>
+        <w:rPr>
+          <w:rFonts w:ascii="Times New Roman" w:hAnsi="Times New Roman" w:cs="Times New Roman"/>
+        </w:rPr>
         <w:t xml:space="preserve">2.</w:t>
       </w:r>
       <w:r>
@@ -25897,6 +26110,9 @@
         <w:ind w:left="480" w:hanging="270"/>
       </w:pPr>
       <w:r>
+        <w:rPr>
+          <w:rFonts w:ascii="Times New Roman" w:hAnsi="Times New Roman" w:cs="Times New Roman"/>
+        </w:rPr>
         <w:t xml:space="preserve">3.</w:t>
       </w:r>
       <w:r>
@@ -25975,6 +26191,9 @@
         <w:ind w:left="480" w:hanging="270"/>
       </w:pPr>
       <w:r>
+        <w:rPr>
+          <w:rFonts w:ascii="Times New Roman" w:hAnsi="Times New Roman" w:cs="Times New Roman"/>
+        </w:rPr>
         <w:t xml:space="preserve">1.</w:t>
       </w:r>
       <w:r>
@@ -25993,6 +26212,9 @@
         <w:ind w:left="480" w:hanging="270"/>
       </w:pPr>
       <w:r>
+        <w:rPr>
+          <w:rFonts w:ascii="Times New Roman" w:hAnsi="Times New Roman" w:cs="Times New Roman"/>
+        </w:rPr>
         <w:t xml:space="preserve">2.</w:t>
       </w:r>
       <w:r>
@@ -26011,6 +26233,9 @@
         <w:ind w:left="480" w:hanging="270"/>
       </w:pPr>
       <w:r>
+        <w:rPr>
+          <w:rFonts w:ascii="Times New Roman" w:hAnsi="Times New Roman" w:cs="Times New Roman"/>
+        </w:rPr>
         <w:t xml:space="preserve">3.</w:t>
       </w:r>
       <w:r>
@@ -26089,6 +26314,9 @@
         <w:ind w:left="480" w:hanging="270"/>
       </w:pPr>
       <w:r>
+        <w:rPr>
+          <w:rFonts w:ascii="Times New Roman" w:hAnsi="Times New Roman" w:cs="Times New Roman"/>
+        </w:rPr>
         <w:t xml:space="preserve">1.</w:t>
       </w:r>
       <w:r>
@@ -26107,6 +26335,9 @@
         <w:ind w:left="480" w:hanging="270"/>
       </w:pPr>
       <w:r>
+        <w:rPr>
+          <w:rFonts w:ascii="Times New Roman" w:hAnsi="Times New Roman" w:cs="Times New Roman"/>
+        </w:rPr>
         <w:t xml:space="preserve">2.</w:t>
       </w:r>
       <w:r>
@@ -26125,6 +26356,9 @@
         <w:ind w:left="480" w:hanging="270"/>
       </w:pPr>
       <w:r>
+        <w:rPr>
+          <w:rFonts w:ascii="Times New Roman" w:hAnsi="Times New Roman" w:cs="Times New Roman"/>
+        </w:rPr>
         <w:t xml:space="preserve">3.</w:t>
       </w:r>
       <w:r>
@@ -26671,7 +26905,7 @@
               <w:jc w:val="left"/>
             </w:pPr>
             <w:r>
-              <w:t xml:space="preserve">触发中期到长期固化</w:t>
+              <w:t xml:space="preserve">触发中期转入长期</w:t>
             </w:r>
           </w:p>
         </w:tc>
@@ -27269,11 +27503,11 @@
         </w:tblCellMar>
       </w:tblPr>
       <w:tblGrid>
-        <w:gridCol w:w="1526"/>
+        <w:gridCol w:w="1598"/>
         <w:gridCol w:w="2410"/>
         <w:gridCol w:w="2750"/>
         <w:gridCol w:w="2279"/>
-        <w:gridCol w:w="901"/>
+        <w:gridCol w:w="829"/>
       </w:tblGrid>
       <w:tr>
         <w:trPr>
@@ -27282,7 +27516,7 @@
         </w:trPr>
         <w:tc>
           <w:tcPr>
-            <w:tcW w:w="1526" w:type="dxa"/>
+            <w:tcW w:w="1598" w:type="dxa"/>
             <w:shd w:val="clear" w:color="auto" w:fill="DCE6F1"/>
             <w:vAlign w:val="center"/>
           </w:tcPr>
@@ -27346,7 +27580,7 @@
         </w:tc>
         <w:tc>
           <w:tcPr>
-            <w:tcW w:w="901" w:type="dxa"/>
+            <w:tcW w:w="829" w:type="dxa"/>
             <w:shd w:val="clear" w:color="auto" w:fill="DCE6F1"/>
             <w:vAlign w:val="center"/>
           </w:tcPr>
@@ -27367,13 +27601,13 @@
         </w:trPr>
         <w:tc>
           <w:tcPr>
-            <w:tcW w:w="1526" w:type="dxa"/>
+            <w:tcW w:w="1598" w:type="dxa"/>
             <w:vAlign w:val="center"/>
           </w:tcPr>
           <w:p>
             <w:pPr>
               <w:pStyle w:val="TableTextS"/>
-              <w:jc w:val="center"/>
+              <w:jc w:val="left"/>
             </w:pPr>
             <w:r>
               <w:t xml:space="preserve">偏好结构化</w:t>
@@ -27427,7 +27661,7 @@
         </w:tc>
         <w:tc>
           <w:tcPr>
-            <w:tcW w:w="901" w:type="dxa"/>
+            <w:tcW w:w="829" w:type="dxa"/>
             <w:vAlign w:val="center"/>
           </w:tcPr>
           <w:p>
@@ -27447,13 +27681,13 @@
         </w:trPr>
         <w:tc>
           <w:tcPr>
-            <w:tcW w:w="1526" w:type="dxa"/>
+            <w:tcW w:w="1598" w:type="dxa"/>
             <w:vAlign w:val="center"/>
           </w:tcPr>
           <w:p>
             <w:pPr>
               <w:pStyle w:val="TableTextS"/>
-              <w:jc w:val="center"/>
+              <w:jc w:val="left"/>
             </w:pPr>
             <w:r>
               <w:t xml:space="preserve">融合抽取</w:t>
@@ -27507,7 +27741,7 @@
         </w:tc>
         <w:tc>
           <w:tcPr>
-            <w:tcW w:w="901" w:type="dxa"/>
+            <w:tcW w:w="829" w:type="dxa"/>
             <w:vAlign w:val="center"/>
           </w:tcPr>
           <w:p>
@@ -27527,13 +27761,13 @@
         </w:trPr>
         <w:tc>
           <w:tcPr>
-            <w:tcW w:w="1526" w:type="dxa"/>
+            <w:tcW w:w="1598" w:type="dxa"/>
             <w:vAlign w:val="center"/>
           </w:tcPr>
           <w:p>
             <w:pPr>
               <w:pStyle w:val="TableTextS"/>
-              <w:jc w:val="center"/>
+              <w:jc w:val="left"/>
             </w:pPr>
             <w:r>
               <w:t xml:space="preserve">版本与场景</w:t>
@@ -27587,7 +27821,7 @@
         </w:tc>
         <w:tc>
           <w:tcPr>
-            <w:tcW w:w="901" w:type="dxa"/>
+            <w:tcW w:w="829" w:type="dxa"/>
             <w:vAlign w:val="center"/>
           </w:tcPr>
           <w:p>
@@ -27607,13 +27841,13 @@
         </w:trPr>
         <w:tc>
           <w:tcPr>
-            <w:tcW w:w="1526" w:type="dxa"/>
+            <w:tcW w:w="1598" w:type="dxa"/>
             <w:vAlign w:val="center"/>
           </w:tcPr>
           <w:p>
             <w:pPr>
               <w:pStyle w:val="TableTextS"/>
-              <w:jc w:val="center"/>
+              <w:jc w:val="left"/>
             </w:pPr>
             <w:r>
               <w:t xml:space="preserve">置信度建模</w:t>
@@ -27667,7 +27901,7 @@
         </w:tc>
         <w:tc>
           <w:tcPr>
-            <w:tcW w:w="901" w:type="dxa"/>
+            <w:tcW w:w="829" w:type="dxa"/>
             <w:vAlign w:val="center"/>
           </w:tcPr>
           <w:p>
@@ -27687,13 +27921,13 @@
         </w:trPr>
         <w:tc>
           <w:tcPr>
-            <w:tcW w:w="1526" w:type="dxa"/>
+            <w:tcW w:w="1598" w:type="dxa"/>
             <w:vAlign w:val="center"/>
           </w:tcPr>
           <w:p>
             <w:pPr>
               <w:pStyle w:val="TableTextS"/>
-              <w:jc w:val="center"/>
+              <w:jc w:val="left"/>
             </w:pPr>
             <w:r>
               <w:t xml:space="preserve">知识冲突裁决</w:t>
@@ -27747,7 +27981,7 @@
         </w:tc>
         <w:tc>
           <w:tcPr>
-            <w:tcW w:w="901" w:type="dxa"/>
+            <w:tcW w:w="829" w:type="dxa"/>
             <w:vAlign w:val="center"/>
           </w:tcPr>
           <w:p>
@@ -27767,13 +28001,13 @@
         </w:trPr>
         <w:tc>
           <w:tcPr>
-            <w:tcW w:w="1526" w:type="dxa"/>
+            <w:tcW w:w="1598" w:type="dxa"/>
             <w:vAlign w:val="center"/>
           </w:tcPr>
           <w:p>
             <w:pPr>
               <w:pStyle w:val="TableTextS"/>
-              <w:jc w:val="center"/>
+              <w:jc w:val="left"/>
             </w:pPr>
             <w:r>
               <w:t xml:space="preserve">关联检索策略</w:t>
@@ -27827,7 +28061,7 @@
         </w:tc>
         <w:tc>
           <w:tcPr>
-            <w:tcW w:w="901" w:type="dxa"/>
+            <w:tcW w:w="829" w:type="dxa"/>
             <w:vAlign w:val="center"/>
           </w:tcPr>
           <w:p>
@@ -27847,13 +28081,13 @@
         </w:trPr>
         <w:tc>
           <w:tcPr>
-            <w:tcW w:w="1526" w:type="dxa"/>
+            <w:tcW w:w="1598" w:type="dxa"/>
             <w:vAlign w:val="center"/>
           </w:tcPr>
           <w:p>
             <w:pPr>
               <w:pStyle w:val="TableTextS"/>
-              <w:jc w:val="center"/>
+              <w:jc w:val="left"/>
             </w:pPr>
             <w:r>
               <w:t xml:space="preserve">端侧轻量化</w:t>
@@ -27907,7 +28141,7 @@
         </w:tc>
         <w:tc>
           <w:tcPr>
-            <w:tcW w:w="901" w:type="dxa"/>
+            <w:tcW w:w="829" w:type="dxa"/>
             <w:vAlign w:val="center"/>
           </w:tcPr>
           <w:p>
@@ -27927,13 +28161,13 @@
         </w:trPr>
         <w:tc>
           <w:tcPr>
-            <w:tcW w:w="1526" w:type="dxa"/>
+            <w:tcW w:w="1598" w:type="dxa"/>
             <w:vAlign w:val="center"/>
           </w:tcPr>
           <w:p>
             <w:pPr>
               <w:pStyle w:val="TableTextS"/>
-              <w:jc w:val="center"/>
+              <w:jc w:val="left"/>
             </w:pPr>
             <w:r>
               <w:t xml:space="preserve">隐私与记忆分离</w:t>
@@ -27987,7 +28221,7 @@
         </w:tc>
         <w:tc>
           <w:tcPr>
-            <w:tcW w:w="901" w:type="dxa"/>
+            <w:tcW w:w="829" w:type="dxa"/>
             <w:vAlign w:val="center"/>
           </w:tcPr>
           <w:p>
@@ -28007,13 +28241,13 @@
         </w:trPr>
         <w:tc>
           <w:tcPr>
-            <w:tcW w:w="1526" w:type="dxa"/>
+            <w:tcW w:w="1598" w:type="dxa"/>
             <w:vAlign w:val="center"/>
           </w:tcPr>
           <w:p>
             <w:pPr>
               <w:pStyle w:val="TableTextS"/>
-              <w:jc w:val="center"/>
+              <w:jc w:val="left"/>
             </w:pPr>
             <w:r>
               <w:t xml:space="preserve">遗忘粒度</w:t>
@@ -28067,7 +28301,7 @@
         </w:tc>
         <w:tc>
           <w:tcPr>
-            <w:tcW w:w="901" w:type="dxa"/>
+            <w:tcW w:w="829" w:type="dxa"/>
             <w:vAlign w:val="center"/>
           </w:tcPr>
           <w:p>
@@ -28087,16 +28321,16 @@
         </w:trPr>
         <w:tc>
           <w:tcPr>
-            <w:tcW w:w="1526" w:type="dxa"/>
+            <w:tcW w:w="1598" w:type="dxa"/>
             <w:vAlign w:val="center"/>
           </w:tcPr>
           <w:p>
             <w:pPr>
               <w:pStyle w:val="TableTextS"/>
-              <w:jc w:val="center"/>
-            </w:pPr>
-            <w:r>
-              <w:t xml:space="preserve">记忆流转与固化</w:t>
+              <w:jc w:val="left"/>
+            </w:pPr>
+            <w:r>
+              <w:t xml:space="preserve">记忆流转与长期化</w:t>
             </w:r>
           </w:p>
         </w:tc>
@@ -28147,7 +28381,7 @@
         </w:tc>
         <w:tc>
           <w:tcPr>
-            <w:tcW w:w="901" w:type="dxa"/>
+            <w:tcW w:w="829" w:type="dxa"/>
             <w:vAlign w:val="center"/>
           </w:tcPr>
           <w:p>
@@ -28167,13 +28401,13 @@
         </w:trPr>
         <w:tc>
           <w:tcPr>
-            <w:tcW w:w="1526" w:type="dxa"/>
+            <w:tcW w:w="1598" w:type="dxa"/>
             <w:vAlign w:val="center"/>
           </w:tcPr>
           <w:p>
             <w:pPr>
               <w:pStyle w:val="TableTextS"/>
-              <w:jc w:val="center"/>
+              <w:jc w:val="left"/>
             </w:pPr>
             <w:r>
               <w:t xml:space="preserve">多源清洗与门控</w:t>
@@ -28227,7 +28461,7 @@
         </w:tc>
         <w:tc>
           <w:tcPr>
-            <w:tcW w:w="901" w:type="dxa"/>
+            <w:tcW w:w="829" w:type="dxa"/>
             <w:vAlign w:val="center"/>
           </w:tcPr>
           <w:p>
@@ -28260,7 +28494,7 @@
     </w:p>
     <w:p>
       <w:r>
-        <w:t xml:space="preserve">本方案直接面向 OS Agent 的记忆模块优化，落地价值体现在四个层面：</w:t>
+        <w:t xml:space="preserve">本方案直接面向 OS Agent 的记忆模块优化，实际价值体现在四个层面：</w:t>
       </w:r>
     </w:p>
     <w:p>
@@ -28272,6 +28506,9 @@
         <w:ind w:left="420" w:hanging="210"/>
       </w:pPr>
       <w:r>
+        <w:rPr>
+          <w:rFonts w:ascii="Times New Roman" w:hAnsi="Times New Roman" w:cs="Times New Roman"/>
+        </w:rPr>
         <w:t xml:space="preserve">•</w:t>
       </w:r>
       <w:r>
@@ -28296,6 +28533,9 @@
         <w:ind w:left="420" w:hanging="210"/>
       </w:pPr>
       <w:r>
+        <w:rPr>
+          <w:rFonts w:ascii="Times New Roman" w:hAnsi="Times New Roman" w:cs="Times New Roman"/>
+        </w:rPr>
         <w:t xml:space="preserve">•</w:t>
       </w:r>
       <w:r>
@@ -28320,6 +28560,9 @@
         <w:ind w:left="420" w:hanging="210"/>
       </w:pPr>
       <w:r>
+        <w:rPr>
+          <w:rFonts w:ascii="Times New Roman" w:hAnsi="Times New Roman" w:cs="Times New Roman"/>
+        </w:rPr>
         <w:t xml:space="preserve">•</w:t>
       </w:r>
       <w:r>
@@ -28344,6 +28587,9 @@
         <w:ind w:left="420" w:hanging="210"/>
       </w:pPr>
       <w:r>
+        <w:rPr>
+          <w:rFonts w:ascii="Times New Roman" w:hAnsi="Times New Roman" w:cs="Times New Roman"/>
+        </w:rPr>
         <w:t xml:space="preserve">•</w:t>
       </w:r>
       <w:r>
@@ -28356,7 +28602,7 @@
         <w:t xml:space="preserve">数据安全合规</w:t>
       </w:r>
       <w:r>
-        <w:t xml:space="preserve">：敏感信息不出本地，记忆库只存不可逆占位符，配合自然语言遗忘满足数据删除权的落地需求。</w:t>
+        <w:t xml:space="preserve">：敏感信息不出本地，记忆库只存不可逆占位符，配合自然语言遗忘满足数据删除权的实际需求。</w:t>
       </w:r>
     </w:p>
     <w:p>
@@ -29319,7 +29565,7 @@
     </w:p>
     <w:p>
       <w:r>
-        <w:t xml:space="preserve">在银河麒麟 V11 真机环境下，主链 7 项要求已通过 HTTP 实跑验证，四类向量化落库、检索延迟与隐私保护链路均在真实系统 SDK 上得到确认。同时，项目如实记录了 8 项未通过案例与若干工程约束，并在第 14 章给出明确的演进优先级。这些缺口是后续迭代的输入，而非需要回避的结论。</w:t>
+        <w:t xml:space="preserve">在银河麒麟 V11 真机环境下，主链 7 项要求已通过 HTTP 实跑验证，四类向量化落库、检索延迟与隐私保护链路均在真实系统 SDK 上得到确认。同时，项目如实记录了 8 项未通过案例与若干工程约束，并在第 14 章给出明确的演进优先级。这些不足是后续迭代的输入，而非需要回避的结论。</w:t>
       </w:r>
     </w:p>
     <w:p>
@@ -29609,7 +29855,7 @@
               <w:jc w:val="center"/>
             </w:pPr>
             <w:r>
-              <w:t xml:space="preserve">固化</w:t>
+              <w:t xml:space="preserve">长期化</w:t>
             </w:r>
           </w:p>
         </w:tc>
@@ -29624,7 +29870,7 @@
               <w:jc w:val="left"/>
             </w:pPr>
             <w:r>
-              <w:t xml:space="preserve">记忆由中期晋升到长期并写入向量库的过程</w:t>
+              <w:t xml:space="preserve">记忆由中期转入长期并写入向量库的过程</w:t>
             </w:r>
           </w:p>
         </w:tc>
@@ -30079,7 +30325,7 @@
               <w:jc w:val="left"/>
             </w:pPr>
             <w:r>
-              <w:t xml:space="preserve">固化后的权威记忆，写入向量库并参与检索</w:t>
+              <w:t xml:space="preserve">长期化后的权威记忆，写入向量库并参与检索</w:t>
             </w:r>
           </w:p>
         </w:tc>
@@ -30175,6 +30421,14 @@
       </w:r>
       <w:r>
         <w:t xml:space="preserve"> 条，值类型覆盖布尔、枚举、整数与字符串四种；场景标识共 6 个，作用域分为全局与场景两级。habit.likes、habit.dislikes 与 habit.possessions 三条按列表合并语义更新，同一偏好的多次表达合并而非覆盖。</w:t>
+      </w:r>
+    </w:p>
+    <w:p>
+      <w:pPr>
+        <w:pStyle w:val="TableCaption"/>
+      </w:pPr>
+      <w:r>
+        <w:t xml:space="preserve">表 A-1  偏好键位注册表（按类别）</w:t>
       </w:r>
     </w:p>
     <w:tbl>
@@ -30662,14 +30916,6 @@
       </w:pPr>
       <w:r>
         <w:t/>
-      </w:r>
-    </w:p>
-    <w:p>
-      <w:pPr>
-        <w:pStyle w:val="Caption"/>
-      </w:pPr>
-      <w:r>
-        <w:t xml:space="preserve">表 A-1  偏好键位注册表（按类别）</w:t>
       </w:r>
     </w:p>
     <w:p>
@@ -31773,6 +32019,7 @@
     <w:pPr>
       <w:spacing w:after="60"/>
       <w:ind w:left="420" w:hanging="210"/>
+      <w:jc w:val="left"/>
     </w:pPr>
   </w:style>
   <w:style w:type="paragraph" w:styleId="TableText">
@@ -31910,6 +32157,22 @@
       <w:szCs w:val="18"/>
     </w:rPr>
   </w:style>
+  <w:style w:type="paragraph" w:styleId="TableCaption">
+    <w:name w:val="Table Caption"/>
+    <w:basedOn w:val="Normal"/>
+    <w:qFormat/>
+    <w:pPr>
+      <w:keepNext/>
+      <w:spacing w:before="120" w:after="60"/>
+      <w:jc w:val="center"/>
+    </w:pPr>
+    <w:rPr>
+      <w:rFonts w:eastAsia="楷体"/>
+      <w:color w:val="595959"/>
+      <w:sz w:val="18"/>
+      <w:szCs w:val="18"/>
+    </w:rPr>
+  </w:style>
   <w:style w:type="paragraph" w:styleId="FigureBox">
     <w:name w:val="Figure Box"/>
     <w:basedOn w:val="Normal"/>

</xml_diff>

<commit_message>
fix(figures): redraw fig-2-4 with shorter boxes
Synced from the source repository at b7eda95.

Written by tools/publish.py: the docx and its PDF export, the
Markdown export, the figures the Markdown links to, and the two
files that describe this repository.  Nothing here is edited by
hand - the next publish overwrites all of it.
</commit_message>
<xml_diff>
--- a/technical-proposal.docx
+++ b/technical-proposal.docx
@@ -2506,7 +2506,7 @@
       <w:r>
         <w:drawing>
           <wp:inline distT="0" distB="0" distL="0" distR="0">
-            <wp:extent cx="5731510" cy="2777264"/>
+            <wp:extent cx="5731510" cy="2763650"/>
             <wp:effectExtent l="0" t="0" r="0" b="0"/>
             <wp:docPr id="102" name="Figure 102"/>
             <wp:cNvGraphicFramePr>
@@ -2534,7 +2534,7 @@
                   <pic:spPr>
                     <a:xfrm>
                       <a:off x="0" y="0"/>
-                      <a:ext cx="5731510" cy="2777264"/>
+                      <a:ext cx="5731510" cy="2763650"/>
                     </a:xfrm>
                     <a:prstGeom prst="rect">
                       <a:avLst/>

</xml_diff>

<commit_message>
style(figures): take fig-2-4 back from drawio
Synced from the source repository at 4f4a8d3.

Written by tools/publish.py: the docx and its PDF export, the
Markdown export, the figures the Markdown links to, and the two
files that describe this repository.  Nothing here is edited by
hand - the next publish overwrites all of it.
</commit_message>
<xml_diff>
--- a/technical-proposal.docx
+++ b/technical-proposal.docx
@@ -2506,7 +2506,7 @@
       <w:r>
         <w:drawing>
           <wp:inline distT="0" distB="0" distL="0" distR="0">
-            <wp:extent cx="5731510" cy="2763650"/>
+            <wp:extent cx="4241317" cy="2782086"/>
             <wp:effectExtent l="0" t="0" r="0" b="0"/>
             <wp:docPr id="102" name="Figure 102"/>
             <wp:cNvGraphicFramePr>
@@ -2534,7 +2534,7 @@
                   <pic:spPr>
                     <a:xfrm>
                       <a:off x="0" y="0"/>
-                      <a:ext cx="5731510" cy="2763650"/>
+                      <a:ext cx="4241317" cy="2782086"/>
                     </a:xfrm>
                     <a:prstGeom prst="rect">
                       <a:avLst/>

</xml_diff>

<commit_message>
fix(content): align TREC and preference figures with the latest evidence
Synced from the source repository at 4b7891c.

Written by tools/publish.py: the docx and its PDF export, the
Markdown export, the figures the Markdown links to, and the two
files that describe this repository.  Nothing here is edited by
hand - the next publish overwrites all of it.
</commit_message>
<xml_diff>
--- a/technical-proposal.docx
+++ b/technical-proposal.docx
@@ -16533,12 +16533,12 @@
         </w:tblCellMar>
       </w:tblPr>
       <w:tblGrid>
-        <w:gridCol w:w="2516"/>
-        <w:gridCol w:w="1422"/>
-        <w:gridCol w:w="1697"/>
-        <w:gridCol w:w="1243"/>
+        <w:gridCol w:w="2875"/>
+        <w:gridCol w:w="1424"/>
+        <w:gridCol w:w="1415"/>
+        <w:gridCol w:w="1201"/>
         <w:gridCol w:w="1934"/>
-        <w:gridCol w:w="1054"/>
+        <w:gridCol w:w="1017"/>
       </w:tblGrid>
       <w:tr>
         <w:trPr>
@@ -16547,7 +16547,7 @@
         </w:trPr>
         <w:tc>
           <w:tcPr>
-            <w:tcW w:w="2516" w:type="dxa"/>
+            <w:tcW w:w="2875" w:type="dxa"/>
             <w:shd w:val="clear" w:color="auto" w:fill="DCE6F1"/>
             <w:vAlign w:val="center"/>
           </w:tcPr>
@@ -16563,7 +16563,7 @@
         </w:tc>
         <w:tc>
           <w:tcPr>
-            <w:tcW w:w="1422" w:type="dxa"/>
+            <w:tcW w:w="1424" w:type="dxa"/>
             <w:shd w:val="clear" w:color="auto" w:fill="DCE6F1"/>
             <w:vAlign w:val="center"/>
           </w:tcPr>
@@ -16579,7 +16579,7 @@
         </w:tc>
         <w:tc>
           <w:tcPr>
-            <w:tcW w:w="1697" w:type="dxa"/>
+            <w:tcW w:w="1415" w:type="dxa"/>
             <w:shd w:val="clear" w:color="auto" w:fill="DCE6F1"/>
             <w:vAlign w:val="center"/>
           </w:tcPr>
@@ -16595,7 +16595,7 @@
         </w:tc>
         <w:tc>
           <w:tcPr>
-            <w:tcW w:w="1243" w:type="dxa"/>
+            <w:tcW w:w="1201" w:type="dxa"/>
             <w:shd w:val="clear" w:color="auto" w:fill="DCE6F1"/>
             <w:vAlign w:val="center"/>
           </w:tcPr>
@@ -16627,7 +16627,7 @@
         </w:tc>
         <w:tc>
           <w:tcPr>
-            <w:tcW w:w="1054" w:type="dxa"/>
+            <w:tcW w:w="1017" w:type="dxa"/>
             <w:shd w:val="clear" w:color="auto" w:fill="DCE6F1"/>
             <w:vAlign w:val="center"/>
           </w:tcPr>
@@ -16648,7 +16648,7 @@
         </w:trPr>
         <w:tc>
           <w:tcPr>
-            <w:tcW w:w="2516" w:type="dxa"/>
+            <w:tcW w:w="2875" w:type="dxa"/>
             <w:vAlign w:val="center"/>
           </w:tcPr>
           <w:p>
@@ -16663,7 +16663,7 @@
         </w:tc>
         <w:tc>
           <w:tcPr>
-            <w:tcW w:w="1422" w:type="dxa"/>
+            <w:tcW w:w="1424" w:type="dxa"/>
             <w:vAlign w:val="center"/>
           </w:tcPr>
           <w:p>
@@ -16678,7 +16678,7 @@
         </w:tc>
         <w:tc>
           <w:tcPr>
-            <w:tcW w:w="1697" w:type="dxa"/>
+            <w:tcW w:w="1415" w:type="dxa"/>
             <w:vAlign w:val="center"/>
           </w:tcPr>
           <w:p>
@@ -16693,7 +16693,7 @@
         </w:tc>
         <w:tc>
           <w:tcPr>
-            <w:tcW w:w="1243" w:type="dxa"/>
+            <w:tcW w:w="1201" w:type="dxa"/>
             <w:vAlign w:val="center"/>
           </w:tcPr>
           <w:p>
@@ -16729,7 +16729,7 @@
         </w:tc>
         <w:tc>
           <w:tcPr>
-            <w:tcW w:w="1054" w:type="dxa"/>
+            <w:tcW w:w="1017" w:type="dxa"/>
             <w:vAlign w:val="center"/>
           </w:tcPr>
           <w:p>
@@ -16749,7 +16749,7 @@
         </w:trPr>
         <w:tc>
           <w:tcPr>
-            <w:tcW w:w="2516" w:type="dxa"/>
+            <w:tcW w:w="2875" w:type="dxa"/>
             <w:vAlign w:val="center"/>
           </w:tcPr>
           <w:p>
@@ -16764,7 +16764,7 @@
         </w:tc>
         <w:tc>
           <w:tcPr>
-            <w:tcW w:w="1422" w:type="dxa"/>
+            <w:tcW w:w="1424" w:type="dxa"/>
             <w:vAlign w:val="center"/>
           </w:tcPr>
           <w:p>
@@ -16779,7 +16779,7 @@
         </w:tc>
         <w:tc>
           <w:tcPr>
-            <w:tcW w:w="1697" w:type="dxa"/>
+            <w:tcW w:w="1415" w:type="dxa"/>
             <w:vAlign w:val="center"/>
           </w:tcPr>
           <w:p>
@@ -16794,7 +16794,7 @@
         </w:tc>
         <w:tc>
           <w:tcPr>
-            <w:tcW w:w="1243" w:type="dxa"/>
+            <w:tcW w:w="1201" w:type="dxa"/>
             <w:vAlign w:val="center"/>
           </w:tcPr>
           <w:p>
@@ -16830,7 +16830,7 @@
         </w:tc>
         <w:tc>
           <w:tcPr>
-            <w:tcW w:w="1054" w:type="dxa"/>
+            <w:tcW w:w="1017" w:type="dxa"/>
             <w:vAlign w:val="center"/>
           </w:tcPr>
           <w:p>
@@ -16850,7 +16850,7 @@
         </w:trPr>
         <w:tc>
           <w:tcPr>
-            <w:tcW w:w="2516" w:type="dxa"/>
+            <w:tcW w:w="2875" w:type="dxa"/>
             <w:vAlign w:val="center"/>
           </w:tcPr>
           <w:p>
@@ -16865,7 +16865,7 @@
         </w:tc>
         <w:tc>
           <w:tcPr>
-            <w:tcW w:w="1422" w:type="dxa"/>
+            <w:tcW w:w="1424" w:type="dxa"/>
             <w:vAlign w:val="center"/>
           </w:tcPr>
           <w:p>
@@ -16880,7 +16880,7 @@
         </w:tc>
         <w:tc>
           <w:tcPr>
-            <w:tcW w:w="1697" w:type="dxa"/>
+            <w:tcW w:w="1415" w:type="dxa"/>
             <w:vAlign w:val="center"/>
           </w:tcPr>
           <w:p>
@@ -16895,7 +16895,7 @@
         </w:tc>
         <w:tc>
           <w:tcPr>
-            <w:tcW w:w="1243" w:type="dxa"/>
+            <w:tcW w:w="1201" w:type="dxa"/>
             <w:vAlign w:val="center"/>
           </w:tcPr>
           <w:p>
@@ -16931,7 +16931,7 @@
         </w:tc>
         <w:tc>
           <w:tcPr>
-            <w:tcW w:w="1054" w:type="dxa"/>
+            <w:tcW w:w="1017" w:type="dxa"/>
             <w:vAlign w:val="center"/>
           </w:tcPr>
           <w:p>
@@ -16951,7 +16951,7 @@
         </w:trPr>
         <w:tc>
           <w:tcPr>
-            <w:tcW w:w="2516" w:type="dxa"/>
+            <w:tcW w:w="2875" w:type="dxa"/>
             <w:vAlign w:val="center"/>
           </w:tcPr>
           <w:p>
@@ -16966,7 +16966,7 @@
         </w:tc>
         <w:tc>
           <w:tcPr>
-            <w:tcW w:w="1422" w:type="dxa"/>
+            <w:tcW w:w="1424" w:type="dxa"/>
             <w:vAlign w:val="center"/>
           </w:tcPr>
           <w:p>
@@ -16981,7 +16981,7 @@
         </w:tc>
         <w:tc>
           <w:tcPr>
-            <w:tcW w:w="1697" w:type="dxa"/>
+            <w:tcW w:w="1415" w:type="dxa"/>
             <w:vAlign w:val="center"/>
           </w:tcPr>
           <w:p>
@@ -16996,7 +16996,7 @@
         </w:tc>
         <w:tc>
           <w:tcPr>
-            <w:tcW w:w="1243" w:type="dxa"/>
+            <w:tcW w:w="1201" w:type="dxa"/>
             <w:vAlign w:val="center"/>
           </w:tcPr>
           <w:p>
@@ -17032,7 +17032,7 @@
         </w:tc>
         <w:tc>
           <w:tcPr>
-            <w:tcW w:w="1054" w:type="dxa"/>
+            <w:tcW w:w="1017" w:type="dxa"/>
             <w:vAlign w:val="center"/>
           </w:tcPr>
           <w:p>
@@ -17052,7 +17052,7 @@
         </w:trPr>
         <w:tc>
           <w:tcPr>
-            <w:tcW w:w="2516" w:type="dxa"/>
+            <w:tcW w:w="2875" w:type="dxa"/>
             <w:vAlign w:val="center"/>
           </w:tcPr>
           <w:p>
@@ -17067,7 +17067,7 @@
         </w:tc>
         <w:tc>
           <w:tcPr>
-            <w:tcW w:w="1422" w:type="dxa"/>
+            <w:tcW w:w="1424" w:type="dxa"/>
             <w:vAlign w:val="center"/>
           </w:tcPr>
           <w:p>
@@ -17082,7 +17082,7 @@
         </w:tc>
         <w:tc>
           <w:tcPr>
-            <w:tcW w:w="1697" w:type="dxa"/>
+            <w:tcW w:w="1415" w:type="dxa"/>
             <w:vAlign w:val="center"/>
           </w:tcPr>
           <w:p>
@@ -17097,7 +17097,7 @@
         </w:tc>
         <w:tc>
           <w:tcPr>
-            <w:tcW w:w="1243" w:type="dxa"/>
+            <w:tcW w:w="1201" w:type="dxa"/>
             <w:vAlign w:val="center"/>
           </w:tcPr>
           <w:p>
@@ -17133,7 +17133,7 @@
         </w:tc>
         <w:tc>
           <w:tcPr>
-            <w:tcW w:w="1054" w:type="dxa"/>
+            <w:tcW w:w="1017" w:type="dxa"/>
             <w:vAlign w:val="center"/>
           </w:tcPr>
           <w:p>
@@ -17153,7 +17153,7 @@
         </w:trPr>
         <w:tc>
           <w:tcPr>
-            <w:tcW w:w="2516" w:type="dxa"/>
+            <w:tcW w:w="2875" w:type="dxa"/>
             <w:vAlign w:val="center"/>
           </w:tcPr>
           <w:p>
@@ -17168,7 +17168,7 @@
         </w:tc>
         <w:tc>
           <w:tcPr>
-            <w:tcW w:w="1422" w:type="dxa"/>
+            <w:tcW w:w="1424" w:type="dxa"/>
             <w:vAlign w:val="center"/>
           </w:tcPr>
           <w:p>
@@ -17183,7 +17183,7 @@
         </w:tc>
         <w:tc>
           <w:tcPr>
-            <w:tcW w:w="1697" w:type="dxa"/>
+            <w:tcW w:w="1415" w:type="dxa"/>
             <w:vAlign w:val="center"/>
           </w:tcPr>
           <w:p>
@@ -17198,7 +17198,7 @@
         </w:tc>
         <w:tc>
           <w:tcPr>
-            <w:tcW w:w="1243" w:type="dxa"/>
+            <w:tcW w:w="1201" w:type="dxa"/>
             <w:vAlign w:val="center"/>
           </w:tcPr>
           <w:p>
@@ -17228,7 +17228,7 @@
         </w:tc>
         <w:tc>
           <w:tcPr>
-            <w:tcW w:w="1054" w:type="dxa"/>
+            <w:tcW w:w="1017" w:type="dxa"/>
             <w:vAlign w:val="center"/>
           </w:tcPr>
           <w:p>
@@ -17248,7 +17248,7 @@
         </w:trPr>
         <w:tc>
           <w:tcPr>
-            <w:tcW w:w="2516" w:type="dxa"/>
+            <w:tcW w:w="2875" w:type="dxa"/>
             <w:vAlign w:val="center"/>
           </w:tcPr>
           <w:p>
@@ -17263,7 +17263,7 @@
         </w:tc>
         <w:tc>
           <w:tcPr>
-            <w:tcW w:w="1422" w:type="dxa"/>
+            <w:tcW w:w="1424" w:type="dxa"/>
             <w:vAlign w:val="center"/>
           </w:tcPr>
           <w:p>
@@ -17278,7 +17278,7 @@
         </w:tc>
         <w:tc>
           <w:tcPr>
-            <w:tcW w:w="1697" w:type="dxa"/>
+            <w:tcW w:w="1415" w:type="dxa"/>
             <w:vAlign w:val="center"/>
           </w:tcPr>
           <w:p>
@@ -17293,7 +17293,7 @@
         </w:tc>
         <w:tc>
           <w:tcPr>
-            <w:tcW w:w="1243" w:type="dxa"/>
+            <w:tcW w:w="1201" w:type="dxa"/>
             <w:vAlign w:val="center"/>
           </w:tcPr>
           <w:p>
@@ -17329,7 +17329,7 @@
         </w:tc>
         <w:tc>
           <w:tcPr>
-            <w:tcW w:w="1054" w:type="dxa"/>
+            <w:tcW w:w="1017" w:type="dxa"/>
             <w:vAlign w:val="center"/>
           </w:tcPr>
           <w:p>
@@ -17349,7 +17349,7 @@
         </w:trPr>
         <w:tc>
           <w:tcPr>
-            <w:tcW w:w="2516" w:type="dxa"/>
+            <w:tcW w:w="2875" w:type="dxa"/>
             <w:vAlign w:val="center"/>
           </w:tcPr>
           <w:p>
@@ -17364,7 +17364,7 @@
         </w:tc>
         <w:tc>
           <w:tcPr>
-            <w:tcW w:w="1422" w:type="dxa"/>
+            <w:tcW w:w="1424" w:type="dxa"/>
             <w:vAlign w:val="center"/>
           </w:tcPr>
           <w:p>
@@ -17379,7 +17379,7 @@
         </w:tc>
         <w:tc>
           <w:tcPr>
-            <w:tcW w:w="1697" w:type="dxa"/>
+            <w:tcW w:w="1415" w:type="dxa"/>
             <w:vAlign w:val="center"/>
           </w:tcPr>
           <w:p>
@@ -17394,7 +17394,7 @@
         </w:tc>
         <w:tc>
           <w:tcPr>
-            <w:tcW w:w="1243" w:type="dxa"/>
+            <w:tcW w:w="1201" w:type="dxa"/>
             <w:vAlign w:val="center"/>
           </w:tcPr>
           <w:p>
@@ -17430,7 +17430,7 @@
         </w:tc>
         <w:tc>
           <w:tcPr>
-            <w:tcW w:w="1054" w:type="dxa"/>
+            <w:tcW w:w="1017" w:type="dxa"/>
             <w:vAlign w:val="center"/>
           </w:tcPr>
           <w:p>
@@ -17450,7 +17450,7 @@
         </w:trPr>
         <w:tc>
           <w:tcPr>
-            <w:tcW w:w="2516" w:type="dxa"/>
+            <w:tcW w:w="2875" w:type="dxa"/>
             <w:vAlign w:val="center"/>
           </w:tcPr>
           <w:p>
@@ -17465,7 +17465,7 @@
         </w:tc>
         <w:tc>
           <w:tcPr>
-            <w:tcW w:w="1422" w:type="dxa"/>
+            <w:tcW w:w="1424" w:type="dxa"/>
             <w:vAlign w:val="center"/>
           </w:tcPr>
           <w:p>
@@ -17480,7 +17480,7 @@
         </w:tc>
         <w:tc>
           <w:tcPr>
-            <w:tcW w:w="1697" w:type="dxa"/>
+            <w:tcW w:w="1415" w:type="dxa"/>
             <w:vAlign w:val="center"/>
           </w:tcPr>
           <w:p>
@@ -17489,13 +17489,13 @@
               <w:jc w:val="left"/>
             </w:pPr>
             <w:r>
-              <w:t xml:space="preserve">150 问 / 2000 段</w:t>
-            </w:r>
-          </w:p>
-        </w:tc>
-        <w:tc>
-          <w:tcPr>
-            <w:tcW w:w="1243" w:type="dxa"/>
+              <w:t xml:space="preserve">150 问（147 有效）/ 2000 段</w:t>
+            </w:r>
+          </w:p>
+        </w:tc>
+        <w:tc>
+          <w:tcPr>
+            <w:tcW w:w="1201" w:type="dxa"/>
             <w:vAlign w:val="center"/>
           </w:tcPr>
           <w:p>
@@ -17531,7 +17531,7 @@
         </w:tc>
         <w:tc>
           <w:tcPr>
-            <w:tcW w:w="1054" w:type="dxa"/>
+            <w:tcW w:w="1017" w:type="dxa"/>
             <w:vAlign w:val="center"/>
           </w:tcPr>
           <w:p>
@@ -17551,7 +17551,7 @@
         </w:trPr>
         <w:tc>
           <w:tcPr>
-            <w:tcW w:w="2516" w:type="dxa"/>
+            <w:tcW w:w="2875" w:type="dxa"/>
             <w:vAlign w:val="center"/>
           </w:tcPr>
           <w:p>
@@ -17566,7 +17566,7 @@
         </w:tc>
         <w:tc>
           <w:tcPr>
-            <w:tcW w:w="1422" w:type="dxa"/>
+            <w:tcW w:w="1424" w:type="dxa"/>
             <w:vAlign w:val="center"/>
           </w:tcPr>
           <w:p>
@@ -17581,7 +17581,7 @@
         </w:tc>
         <w:tc>
           <w:tcPr>
-            <w:tcW w:w="1697" w:type="dxa"/>
+            <w:tcW w:w="1415" w:type="dxa"/>
             <w:vAlign w:val="center"/>
           </w:tcPr>
           <w:p>
@@ -17596,7 +17596,7 @@
         </w:tc>
         <w:tc>
           <w:tcPr>
-            <w:tcW w:w="1243" w:type="dxa"/>
+            <w:tcW w:w="1201" w:type="dxa"/>
             <w:vAlign w:val="center"/>
           </w:tcPr>
           <w:p>
@@ -17626,7 +17626,7 @@
         </w:tc>
         <w:tc>
           <w:tcPr>
-            <w:tcW w:w="1054" w:type="dxa"/>
+            <w:tcW w:w="1017" w:type="dxa"/>
             <w:vAlign w:val="center"/>
           </w:tcPr>
           <w:p>
@@ -17649,7 +17649,7 @@
         </w:trPr>
         <w:tc>
           <w:tcPr>
-            <w:tcW w:w="2516" w:type="dxa"/>
+            <w:tcW w:w="2875" w:type="dxa"/>
             <w:vAlign w:val="center"/>
           </w:tcPr>
           <w:p>
@@ -17664,7 +17664,7 @@
         </w:tc>
         <w:tc>
           <w:tcPr>
-            <w:tcW w:w="1422" w:type="dxa"/>
+            <w:tcW w:w="1424" w:type="dxa"/>
             <w:vAlign w:val="center"/>
           </w:tcPr>
           <w:p>
@@ -17679,7 +17679,7 @@
         </w:tc>
         <w:tc>
           <w:tcPr>
-            <w:tcW w:w="1697" w:type="dxa"/>
+            <w:tcW w:w="1415" w:type="dxa"/>
             <w:vAlign w:val="center"/>
           </w:tcPr>
           <w:p>
@@ -17694,7 +17694,7 @@
         </w:tc>
         <w:tc>
           <w:tcPr>
-            <w:tcW w:w="1243" w:type="dxa"/>
+            <w:tcW w:w="1201" w:type="dxa"/>
             <w:vAlign w:val="center"/>
           </w:tcPr>
           <w:p>
@@ -17730,7 +17730,7 @@
         </w:tc>
         <w:tc>
           <w:tcPr>
-            <w:tcW w:w="1054" w:type="dxa"/>
+            <w:tcW w:w="1017" w:type="dxa"/>
             <w:vAlign w:val="center"/>
           </w:tcPr>
           <w:p>
@@ -17750,7 +17750,7 @@
         </w:trPr>
         <w:tc>
           <w:tcPr>
-            <w:tcW w:w="2516" w:type="dxa"/>
+            <w:tcW w:w="2875" w:type="dxa"/>
             <w:vAlign w:val="center"/>
           </w:tcPr>
           <w:p>
@@ -17765,7 +17765,7 @@
         </w:tc>
         <w:tc>
           <w:tcPr>
-            <w:tcW w:w="1422" w:type="dxa"/>
+            <w:tcW w:w="1424" w:type="dxa"/>
             <w:vAlign w:val="center"/>
           </w:tcPr>
           <w:p>
@@ -17780,7 +17780,7 @@
         </w:tc>
         <w:tc>
           <w:tcPr>
-            <w:tcW w:w="1697" w:type="dxa"/>
+            <w:tcW w:w="1415" w:type="dxa"/>
             <w:vAlign w:val="center"/>
           </w:tcPr>
           <w:p>
@@ -17789,13 +17789,13 @@
               <w:jc w:val="left"/>
             </w:pPr>
             <w:r>
-              <w:t xml:space="preserve">100</w:t>
-            </w:r>
-          </w:p>
-        </w:tc>
-        <w:tc>
-          <w:tcPr>
-            <w:tcW w:w="1243" w:type="dxa"/>
+              <w:t xml:space="preserve">150</w:t>
+            </w:r>
+          </w:p>
+        </w:tc>
+        <w:tc>
+          <w:tcPr>
+            <w:tcW w:w="1201" w:type="dxa"/>
             <w:vAlign w:val="center"/>
           </w:tcPr>
           <w:p>
@@ -17834,7 +17834,7 @@
         </w:tc>
         <w:tc>
           <w:tcPr>
-            <w:tcW w:w="1054" w:type="dxa"/>
+            <w:tcW w:w="1017" w:type="dxa"/>
             <w:vAlign w:val="center"/>
           </w:tcPr>
           <w:p>
@@ -17854,7 +17854,7 @@
         </w:trPr>
         <w:tc>
           <w:tcPr>
-            <w:tcW w:w="2516" w:type="dxa"/>
+            <w:tcW w:w="2875" w:type="dxa"/>
             <w:vAlign w:val="center"/>
           </w:tcPr>
           <w:p>
@@ -17869,7 +17869,7 @@
         </w:tc>
         <w:tc>
           <w:tcPr>
-            <w:tcW w:w="1422" w:type="dxa"/>
+            <w:tcW w:w="1424" w:type="dxa"/>
             <w:vAlign w:val="center"/>
           </w:tcPr>
           <w:p>
@@ -17884,7 +17884,7 @@
         </w:tc>
         <w:tc>
           <w:tcPr>
-            <w:tcW w:w="1697" w:type="dxa"/>
+            <w:tcW w:w="1415" w:type="dxa"/>
             <w:vAlign w:val="center"/>
           </w:tcPr>
           <w:p>
@@ -17899,7 +17899,7 @@
         </w:tc>
         <w:tc>
           <w:tcPr>
-            <w:tcW w:w="1243" w:type="dxa"/>
+            <w:tcW w:w="1201" w:type="dxa"/>
             <w:vAlign w:val="center"/>
           </w:tcPr>
           <w:p>
@@ -17935,7 +17935,7 @@
         </w:tc>
         <w:tc>
           <w:tcPr>
-            <w:tcW w:w="1054" w:type="dxa"/>
+            <w:tcW w:w="1017" w:type="dxa"/>
             <w:vAlign w:val="center"/>
           </w:tcPr>
           <w:p>
@@ -18063,10 +18063,10 @@
         </w:tblCellMar>
       </w:tblPr>
       <w:tblGrid>
-        <w:gridCol w:w="4740"/>
-        <w:gridCol w:w="1884"/>
-        <w:gridCol w:w="1120"/>
-        <w:gridCol w:w="2122"/>
+        <w:gridCol w:w="4591"/>
+        <w:gridCol w:w="1775"/>
+        <w:gridCol w:w="1209"/>
+        <w:gridCol w:w="2291"/>
       </w:tblGrid>
       <w:tr>
         <w:trPr>
@@ -18075,7 +18075,7 @@
         </w:trPr>
         <w:tc>
           <w:tcPr>
-            <w:tcW w:w="4740" w:type="dxa"/>
+            <w:tcW w:w="4591" w:type="dxa"/>
             <w:shd w:val="clear" w:color="auto" w:fill="DCE6F1"/>
             <w:vAlign w:val="center"/>
           </w:tcPr>
@@ -18091,7 +18091,7 @@
         </w:tc>
         <w:tc>
           <w:tcPr>
-            <w:tcW w:w="1884" w:type="dxa"/>
+            <w:tcW w:w="1775" w:type="dxa"/>
             <w:shd w:val="clear" w:color="auto" w:fill="DCE6F1"/>
             <w:vAlign w:val="center"/>
           </w:tcPr>
@@ -18107,7 +18107,7 @@
         </w:tc>
         <w:tc>
           <w:tcPr>
-            <w:tcW w:w="1120" w:type="dxa"/>
+            <w:tcW w:w="1209" w:type="dxa"/>
             <w:shd w:val="clear" w:color="auto" w:fill="DCE6F1"/>
             <w:vAlign w:val="center"/>
           </w:tcPr>
@@ -18123,7 +18123,7 @@
         </w:tc>
         <w:tc>
           <w:tcPr>
-            <w:tcW w:w="2122" w:type="dxa"/>
+            <w:tcW w:w="2291" w:type="dxa"/>
             <w:shd w:val="clear" w:color="auto" w:fill="DCE6F1"/>
             <w:vAlign w:val="center"/>
           </w:tcPr>
@@ -18144,7 +18144,7 @@
         </w:trPr>
         <w:tc>
           <w:tcPr>
-            <w:tcW w:w="4740" w:type="dxa"/>
+            <w:tcW w:w="4591" w:type="dxa"/>
             <w:vAlign w:val="center"/>
           </w:tcPr>
           <w:p>
@@ -18159,22 +18159,22 @@
         </w:tc>
         <w:tc>
           <w:tcPr>
-            <w:tcW w:w="1884" w:type="dxa"/>
-            <w:vAlign w:val="center"/>
-          </w:tcPr>
-          <w:p>
-            <w:pPr>
-              <w:pStyle w:val="TableText"/>
-              <w:jc w:val="left"/>
-            </w:pPr>
-            <w:r>
-              <w:t xml:space="preserve">150 问 / 2000 段</w:t>
-            </w:r>
-          </w:p>
-        </w:tc>
-        <w:tc>
-          <w:tcPr>
-            <w:tcW w:w="1120" w:type="dxa"/>
+            <w:tcW w:w="1775" w:type="dxa"/>
+            <w:vAlign w:val="center"/>
+          </w:tcPr>
+          <w:p>
+            <w:pPr>
+              <w:pStyle w:val="TableText"/>
+              <w:jc w:val="left"/>
+            </w:pPr>
+            <w:r>
+              <w:t xml:space="preserve">150 问（147 有效）/ 2000 段</w:t>
+            </w:r>
+          </w:p>
+        </w:tc>
+        <w:tc>
+          <w:tcPr>
+            <w:tcW w:w="1209" w:type="dxa"/>
             <w:vAlign w:val="center"/>
           </w:tcPr>
           <w:p>
@@ -18192,7 +18192,7 @@
         </w:tc>
         <w:tc>
           <w:tcPr>
-            <w:tcW w:w="2122" w:type="dxa"/>
+            <w:tcW w:w="2291" w:type="dxa"/>
             <w:vAlign w:val="center"/>
           </w:tcPr>
           <w:p>
@@ -18215,7 +18215,7 @@
         </w:trPr>
         <w:tc>
           <w:tcPr>
-            <w:tcW w:w="4740" w:type="dxa"/>
+            <w:tcW w:w="4591" w:type="dxa"/>
             <w:vAlign w:val="center"/>
           </w:tcPr>
           <w:p>
@@ -18230,7 +18230,7 @@
         </w:tc>
         <w:tc>
           <w:tcPr>
-            <w:tcW w:w="1884" w:type="dxa"/>
+            <w:tcW w:w="1775" w:type="dxa"/>
             <w:vAlign w:val="center"/>
           </w:tcPr>
           <w:p>
@@ -18245,7 +18245,7 @@
         </w:tc>
         <w:tc>
           <w:tcPr>
-            <w:tcW w:w="1120" w:type="dxa"/>
+            <w:tcW w:w="1209" w:type="dxa"/>
             <w:vAlign w:val="center"/>
           </w:tcPr>
           <w:p>
@@ -18260,7 +18260,7 @@
         </w:tc>
         <w:tc>
           <w:tcPr>
-            <w:tcW w:w="2122" w:type="dxa"/>
+            <w:tcW w:w="2291" w:type="dxa"/>
             <w:vAlign w:val="center"/>
           </w:tcPr>
           <w:p>
@@ -18280,7 +18280,7 @@
         </w:trPr>
         <w:tc>
           <w:tcPr>
-            <w:tcW w:w="4740" w:type="dxa"/>
+            <w:tcW w:w="4591" w:type="dxa"/>
             <w:vAlign w:val="center"/>
           </w:tcPr>
           <w:p>
@@ -18295,7 +18295,7 @@
         </w:tc>
         <w:tc>
           <w:tcPr>
-            <w:tcW w:w="1884" w:type="dxa"/>
+            <w:tcW w:w="1775" w:type="dxa"/>
             <w:vAlign w:val="center"/>
           </w:tcPr>
           <w:p>
@@ -18310,7 +18310,7 @@
         </w:tc>
         <w:tc>
           <w:tcPr>
-            <w:tcW w:w="1120" w:type="dxa"/>
+            <w:tcW w:w="1209" w:type="dxa"/>
             <w:vAlign w:val="center"/>
           </w:tcPr>
           <w:p>
@@ -18325,7 +18325,7 @@
         </w:tc>
         <w:tc>
           <w:tcPr>
-            <w:tcW w:w="2122" w:type="dxa"/>
+            <w:tcW w:w="2291" w:type="dxa"/>
             <w:vAlign w:val="center"/>
           </w:tcPr>
           <w:p>
@@ -18345,7 +18345,7 @@
         </w:trPr>
         <w:tc>
           <w:tcPr>
-            <w:tcW w:w="4740" w:type="dxa"/>
+            <w:tcW w:w="4591" w:type="dxa"/>
             <w:vAlign w:val="center"/>
           </w:tcPr>
           <w:p>
@@ -18360,7 +18360,7 @@
         </w:tc>
         <w:tc>
           <w:tcPr>
-            <w:tcW w:w="1884" w:type="dxa"/>
+            <w:tcW w:w="1775" w:type="dxa"/>
             <w:vAlign w:val="center"/>
           </w:tcPr>
           <w:p>
@@ -18375,7 +18375,7 @@
         </w:tc>
         <w:tc>
           <w:tcPr>
-            <w:tcW w:w="1120" w:type="dxa"/>
+            <w:tcW w:w="1209" w:type="dxa"/>
             <w:vAlign w:val="center"/>
           </w:tcPr>
           <w:p>
@@ -18390,7 +18390,7 @@
         </w:tc>
         <w:tc>
           <w:tcPr>
-            <w:tcW w:w="2122" w:type="dxa"/>
+            <w:tcW w:w="2291" w:type="dxa"/>
             <w:vAlign w:val="center"/>
           </w:tcPr>
           <w:p>
@@ -18410,7 +18410,7 @@
         </w:trPr>
         <w:tc>
           <w:tcPr>
-            <w:tcW w:w="4740" w:type="dxa"/>
+            <w:tcW w:w="4591" w:type="dxa"/>
             <w:vAlign w:val="center"/>
           </w:tcPr>
           <w:p>
@@ -18425,7 +18425,7 @@
         </w:tc>
         <w:tc>
           <w:tcPr>
-            <w:tcW w:w="1884" w:type="dxa"/>
+            <w:tcW w:w="1775" w:type="dxa"/>
             <w:vAlign w:val="center"/>
           </w:tcPr>
           <w:p>
@@ -18440,7 +18440,7 @@
         </w:tc>
         <w:tc>
           <w:tcPr>
-            <w:tcW w:w="1120" w:type="dxa"/>
+            <w:tcW w:w="1209" w:type="dxa"/>
             <w:vAlign w:val="center"/>
           </w:tcPr>
           <w:p>
@@ -18455,7 +18455,7 @@
         </w:tc>
         <w:tc>
           <w:tcPr>
-            <w:tcW w:w="2122" w:type="dxa"/>
+            <w:tcW w:w="2291" w:type="dxa"/>
             <w:vAlign w:val="center"/>
           </w:tcPr>
           <w:p>
@@ -18475,7 +18475,7 @@
         </w:trPr>
         <w:tc>
           <w:tcPr>
-            <w:tcW w:w="4740" w:type="dxa"/>
+            <w:tcW w:w="4591" w:type="dxa"/>
             <w:vAlign w:val="center"/>
           </w:tcPr>
           <w:p>
@@ -18490,7 +18490,7 @@
         </w:tc>
         <w:tc>
           <w:tcPr>
-            <w:tcW w:w="1884" w:type="dxa"/>
+            <w:tcW w:w="1775" w:type="dxa"/>
             <w:vAlign w:val="center"/>
           </w:tcPr>
           <w:p>
@@ -18505,22 +18505,22 @@
         </w:tc>
         <w:tc>
           <w:tcPr>
-            <w:tcW w:w="1120" w:type="dxa"/>
-            <w:vAlign w:val="center"/>
-          </w:tcPr>
-          <w:p>
-            <w:pPr>
-              <w:pStyle w:val="TableText"/>
-              <w:jc w:val="center"/>
-            </w:pPr>
-            <w:r>
-              <w:t xml:space="preserve">0.1591</w:t>
-            </w:r>
-          </w:p>
-        </w:tc>
-        <w:tc>
-          <w:tcPr>
-            <w:tcW w:w="2122" w:type="dxa"/>
+            <w:tcW w:w="1209" w:type="dxa"/>
+            <w:vAlign w:val="center"/>
+          </w:tcPr>
+          <w:p>
+            <w:pPr>
+              <w:pStyle w:val="TableText"/>
+              <w:jc w:val="center"/>
+            </w:pPr>
+            <w:r>
+              <w:t xml:space="preserve">0.158</w:t>
+            </w:r>
+          </w:p>
+        </w:tc>
+        <w:tc>
+          <w:tcPr>
+            <w:tcW w:w="2291" w:type="dxa"/>
             <w:vAlign w:val="center"/>
           </w:tcPr>
           <w:p>

</xml_diff>

<commit_message>
fix(content): align the latency and conflict tables with the latest round
Synced from the source repository at e58bbd0.

Written by tools/publish.py: the docx and its PDF export, the
Markdown export, the figures the Markdown links to, and the two
files that describe this repository.  Nothing here is edited by
hand - the next publish overwrites all of it.
</commit_message>
<xml_diff>
--- a/technical-proposal.docx
+++ b/technical-proposal.docx
@@ -17590,7 +17590,7 @@
               <w:jc w:val="left"/>
             </w:pPr>
             <w:r>
-              <w:t xml:space="preserve">97 问 / 7707 段</w:t>
+              <w:t xml:space="preserve">97 问 / 9707 段</w:t>
             </w:r>
           </w:p>
         </w:tc>
@@ -18499,7 +18499,7 @@
               <w:jc w:val="left"/>
             </w:pPr>
             <w:r>
-              <w:t xml:space="preserve">97 问 / 7707 段</w:t>
+              <w:t xml:space="preserve">97 问 / 9707 段</w:t>
             </w:r>
           </w:p>
         </w:tc>
@@ -18674,6 +18674,56 @@
               <w:rPr>
                 <w:b/>
               </w:rPr>
+              <w:t xml:space="preserve">109.3ms</w:t>
+            </w:r>
+          </w:p>
+        </w:tc>
+        <w:tc>
+          <w:tcPr>
+            <w:tcW w:w="1901" w:type="dxa"/>
+            <w:vAlign w:val="center"/>
+          </w:tcPr>
+          <w:p>
+            <w:pPr>
+              <w:pStyle w:val="TableText"/>
+              <w:jc w:val="center"/>
+            </w:pPr>
+            <w:r>
+              <w:t xml:space="preserve">达标</w:t>
+            </w:r>
+          </w:p>
+        </w:tc>
+      </w:tr>
+      <w:tr>
+        <w:trPr>
+          <w:cantSplit/>
+        </w:trPr>
+        <w:tc>
+          <w:tcPr>
+            <w:tcW w:w="5414" w:type="dxa"/>
+            <w:vAlign w:val="center"/>
+          </w:tcPr>
+          <w:p>
+            <w:pPr>
+              <w:pStyle w:val="TableText"/>
+              <w:jc w:val="left"/>
+            </w:pPr>
+            <w:r>
+              <w:t xml:space="preserve">MS MARCO · 纯语义检索</w:t>
+            </w:r>
+          </w:p>
+        </w:tc>
+        <w:tc>
+          <w:tcPr>
+            <w:tcW w:w="2551" w:type="dxa"/>
+            <w:vAlign w:val="center"/>
+          </w:tcPr>
+          <w:p>
+            <w:pPr>
+              <w:pStyle w:val="TableText"/>
+              <w:jc w:val="center"/>
+            </w:pPr>
+            <w:r>
               <w:t xml:space="preserve">108.6ms</w:t>
             </w:r>
           </w:p>
@@ -18709,7 +18759,7 @@
               <w:jc w:val="left"/>
             </w:pPr>
             <w:r>
-              <w:t xml:space="preserve">MS MARCO · 纯语义检索</w:t>
+              <w:t xml:space="preserve">MS MARCO · 组件检索</w:t>
             </w:r>
           </w:p>
         </w:tc>
@@ -18724,7 +18774,7 @@
               <w:jc w:val="center"/>
             </w:pPr>
             <w:r>
-              <w:t xml:space="preserve">103.0ms</w:t>
+              <w:t xml:space="preserve">169.6ms</w:t>
             </w:r>
           </w:p>
         </w:tc>
@@ -18759,7 +18809,7 @@
               <w:jc w:val="left"/>
             </w:pPr>
             <w:r>
-              <w:t xml:space="preserve">MS MARCO · 组件检索</w:t>
+              <w:t xml:space="preserve">对话 / 行为类自检索</w:t>
             </w:r>
           </w:p>
         </w:tc>
@@ -18774,7 +18824,7 @@
               <w:jc w:val="center"/>
             </w:pPr>
             <w:r>
-              <w:t xml:space="preserve">169.6ms</w:t>
+              <w:t xml:space="preserve">36.1 ~ 77.2ms</w:t>
             </w:r>
           </w:p>
         </w:tc>
@@ -18809,7 +18859,7 @@
               <w:jc w:val="left"/>
             </w:pPr>
             <w:r>
-              <w:t xml:space="preserve">对话 / 行为类自检索</w:t>
+              <w:t xml:space="preserve">LongMemEval 冲突后语义召回</w:t>
             </w:r>
           </w:p>
         </w:tc>
@@ -18824,7 +18874,7 @@
               <w:jc w:val="center"/>
             </w:pPr>
             <w:r>
-              <w:t xml:space="preserve">36.1 ~ 77.2ms</w:t>
+              <w:t xml:space="preserve">64.5ms</w:t>
             </w:r>
           </w:p>
         </w:tc>
@@ -18859,7 +18909,7 @@
               <w:jc w:val="left"/>
             </w:pPr>
             <w:r>
-              <w:t xml:space="preserve">LongMemEval 冲突后语义召回</w:t>
+              <w:t xml:space="preserve">TREC · 纯语义检索</w:t>
             </w:r>
           </w:p>
         </w:tc>
@@ -18874,57 +18924,7 @@
               <w:jc w:val="center"/>
             </w:pPr>
             <w:r>
-              <w:t xml:space="preserve">64.5ms</w:t>
-            </w:r>
-          </w:p>
-        </w:tc>
-        <w:tc>
-          <w:tcPr>
-            <w:tcW w:w="1901" w:type="dxa"/>
-            <w:vAlign w:val="center"/>
-          </w:tcPr>
-          <w:p>
-            <w:pPr>
-              <w:pStyle w:val="TableText"/>
-              <w:jc w:val="center"/>
-            </w:pPr>
-            <w:r>
-              <w:t xml:space="preserve">达标</w:t>
-            </w:r>
-          </w:p>
-        </w:tc>
-      </w:tr>
-      <w:tr>
-        <w:trPr>
-          <w:cantSplit/>
-        </w:trPr>
-        <w:tc>
-          <w:tcPr>
-            <w:tcW w:w="5414" w:type="dxa"/>
-            <w:vAlign w:val="center"/>
-          </w:tcPr>
-          <w:p>
-            <w:pPr>
-              <w:pStyle w:val="TableText"/>
-              <w:jc w:val="left"/>
-            </w:pPr>
-            <w:r>
-              <w:t xml:space="preserve">TREC · 纯语义检索</w:t>
-            </w:r>
-          </w:p>
-        </w:tc>
-        <w:tc>
-          <w:tcPr>
-            <w:tcW w:w="2551" w:type="dxa"/>
-            <w:vAlign w:val="center"/>
-          </w:tcPr>
-          <w:p>
-            <w:pPr>
-              <w:pStyle w:val="TableText"/>
-              <w:jc w:val="center"/>
-            </w:pPr>
-            <w:r>
-              <w:t xml:space="preserve">386ms</w:t>
+              <w:t xml:space="preserve">475.6ms</w:t>
             </w:r>
           </w:p>
         </w:tc>
@@ -19008,7 +19008,7 @@
     </w:p>
     <w:p>
       <w:r>
-        <w:t xml:space="preserve">TREC 一行曾有两个结论：纯语义路径 386ms 达标，而默认编排在 2026-09-14 轮因词面补充召回路径把 P95 抬到 1005ms 而破线（97 个问句中 36 个误走词面全表扫描）。该缺陷已修复：英文开放域问句不再默认走面向中文办公场景的词面门控，2026-09-15 轮实测默认编排 </w:t>
+        <w:t xml:space="preserve">TREC 一行曾有两个结论：纯语义路径 475.6ms 达标，而默认编排在 2026-09-14 轮因词面补充召回路径把 P95 抬到 1005ms 而破线（97 个问句中 36 个误走词面全表扫描）。该缺陷已修复：英文开放域问句不再默认走面向中文办公场景的词面门控，2026-09-15 轮实测默认编排 </w:t>
       </w:r>
       <w:r>
         <w:rPr>
@@ -19017,7 +19017,7 @@
         <w:t xml:space="preserve">478.9ms</w:t>
       </w:r>
       <w:r>
-        <w:t xml:space="preserve">，达标；同轮 MS MARCO 默认编排 P95 = 108.6ms。</w:t>
+        <w:t xml:space="preserve">，达标；同轮 MS MARCO 默认编排 P95 = 109.3ms、纯语义 108.6ms。</w:t>
       </w:r>
       <w:r>
         <w:rPr>
@@ -19349,7 +19349,7 @@
               <w:jc w:val="left"/>
             </w:pPr>
             <w:r>
-              <w:t xml:space="preserve">金标准答案字面匹配（仅作诊断参考，上一轮）</w:t>
+              <w:t xml:space="preserve">金标准答案字面匹配（仅作诊断参考）</w:t>
             </w:r>
           </w:p>
         </w:tc>
@@ -19364,7 +19364,7 @@
               <w:jc w:val="center"/>
             </w:pPr>
             <w:r>
-              <w:t xml:space="preserve">92</w:t>
+              <w:t xml:space="preserve">142</w:t>
             </w:r>
           </w:p>
         </w:tc>
@@ -19379,7 +19379,7 @@
               <w:jc w:val="center"/>
             </w:pPr>
             <w:r>
-              <w:t xml:space="preserve">0.5217</w:t>
+              <w:t xml:space="preserve">0.507</w:t>
             </w:r>
           </w:p>
         </w:tc>
@@ -19453,7 +19453,7 @@
               <w:pStyle w:val="Note"/>
             </w:pPr>
             <w:r>
-              <w:t xml:space="preserve">表内「金标准答案字面匹配」是「回答文本是否包含金标准答案串」的宽松诊断指标，受生成阶段表述差异影响较大，与冲突处理正确率并非同一口径；冲突机制本身的效果以解析器与端到端两行为准。2026-09-15 轮把测试集扩到 142 对（更新 70 / 对照 72），两行仍为 142/142 全对。</w:t>
+              <w:t xml:space="preserve">表内「金标准答案字面匹配」是「回答文本是否包含金标准答案串」的宽松诊断指标，受生成阶段表述差异影响较大，与冲突处理正确率并非同一口径；冲突机制本身的效果以解析器与端到端两行为准。2026-09-15 轮把测试集扩到 142 对（更新 70 / 对照 72），两行仍为 142/142 全对，同期字面匹配为 72 / 142 = 0.507。</w:t>
             </w:r>
           </w:p>
           <w:p>

</xml_diff>

<commit_message>
fix(style): put the table 9-3 label under its table
Synced from the source repository at e8cad9b.
</commit_message>
<xml_diff>
--- a/technical-proposal.docx
+++ b/technical-proposal.docx
@@ -21653,14 +21653,6 @@
         <w:t xml:space="preserve">。</w:t>
       </w:r>
     </w:p>
-    <w:p>
-      <w:pPr>
-        <w:pStyle w:val="TableCaption"/>
-      </w:pPr>
-      <w:r>
-        <w:t xml:space="preserve">表 9-3  银河麒麟 V11 真机验收结果</w:t>
-      </w:r>
-    </w:p>
     <w:tbl>
       <w:tblPr>
         <w:tblStyle w:val="GridTable"/>
@@ -22002,6 +21994,14 @@
       </w:pPr>
       <w:r>
         <w:t/>
+      </w:r>
+    </w:p>
+    <w:p>
+      <w:pPr>
+        <w:pStyle w:val="TableCaption"/>
+      </w:pPr>
+      <w:r>
+        <w:t xml:space="preserve">表 9-3  银河麒麟 V11 真机验收结果</w:t>
       </w:r>
     </w:p>
     <w:p>

</xml_diff>